<commit_message>
Update portfolio from latest resume
</commit_message>
<xml_diff>
--- a/assets/resume/Hariharan_J_Resume.docx
+++ b/assets/resume/Hariharan_J_Resume.docx
@@ -46,9 +46,9 @@
                 <w:rFonts w:ascii="Aptos" w:hAnsi="Aptos"/>
                 <w:b/>
                 <w:color w:val="1A73E8"/>
-                <w:sz w:val="19"/>
+                <w:sz w:val="18"/>
               </w:rPr>
-              <w:t>Cloud Engineer Intern | AWS CCP | Google ACE | Cybersecurity Engineering</w:t>
+              <w:t>Cloud Engineer | AWS Certified Cloud Practitioner | Google Associate Cloud Engineer</w:t>
             </w:r>
           </w:p>
           <w:p>
@@ -70,7 +70,7 @@
                 <w:color w:val="5F6368"/>
                 <w:sz w:val="17"/>
               </w:rPr>
-              <w:t>linkedin.com/in/hariharan-j-2a909a290 | github.com/Jhsoul69</w:t>
+              <w:t>linkedin.com/in/hariharan-j-2a909a290 | github.com/cloudy-fix</w:t>
             </w:r>
           </w:p>
         </w:tc>
@@ -200,7 +200,7 @@
                     <a:graphicData uri="http://schemas.openxmlformats.org/drawingml/2006/picture">
                       <pic:pic>
                         <pic:nvPicPr>
-                          <pic:cNvPr id="0" name="linux.png"/>
+                          <pic:cNvPr id="0" name="oracle.png"/>
                           <pic:cNvPicPr/>
                         </pic:nvPicPr>
                         <pic:blipFill>
@@ -232,7 +232,7 @@
                 <w:color w:val="253044"/>
                 <w:sz w:val="17"/>
               </w:rPr>
-              <w:t>Cybersecurity</w:t>
+              <w:t>OCI Learning</w:t>
             </w:r>
           </w:p>
           <w:p>
@@ -288,7 +288,7 @@
     </w:tbl>
     <w:p>
       <w:pPr>
-        <w:spacing w:before="260" w:after="140"/>
+        <w:spacing w:before="240" w:after="120"/>
       </w:pPr>
       <w:r>
         <w:rPr>
@@ -334,7 +334,7 @@
                 <w:color w:val="3C4043"/>
                 <w:sz w:val="18"/>
               </w:rPr>
-              <w:t>Cloud engineering fresher with hands-on AWS and Google Cloud experience across IAM, VPC, Route 53, Cloud DNS, HA VPN, database migration, load balancing, Docker, Kubernetes, Linux, Terraform, and security-aware infrastructure. Strong cybersecurity engineering foundation with backend API experience in Python, FastAPI, REST APIs, secure authentication, and automation.</w:t>
+              <w:t>Cloud engineering fresher with hands-on experience administering AWS and Google Cloud infrastructure - IAM, VPC, DNS, VPN, database migration, load balancing, and Linux operations. AWS Certified Cloud Practitioner and Google Associate Cloud Engineer with a Cybersecurity Engineering foundation and backend automation experience in Python and FastAPI. Currently building working knowledge of Oracle Cloud Infrastructure (OCI) and IBM Cloud to extend existing multi-cloud administration skills.</w:t>
             </w:r>
           </w:p>
         </w:tc>
@@ -342,1717 +342,7 @@
     </w:tbl>
     <w:p>
       <w:pPr>
-        <w:spacing w:before="260" w:after="140"/>
-      </w:pPr>
-      <w:r>
-        <w:rPr>
-          <w:rFonts w:ascii="Aptos" w:hAnsi="Aptos"/>
-          <w:b/>
-          <w:color w:val="202124"/>
-          <w:sz w:val="21"/>
-        </w:rPr>
-        <w:t>CORE TECHNOLOGY STACK</w:t>
-      </w:r>
-    </w:p>
-    <w:tbl>
-      <w:tblPr>
-        <w:tblW w:type="auto" w:w="0"/>
-        <w:jc w:val="center"/>
-        <w:tblLayout w:type="autofit"/>
-        <w:tblLook w:firstColumn="1" w:firstRow="1" w:lastColumn="0" w:lastRow="0" w:noHBand="0" w:noVBand="1" w:val="04A0"/>
-      </w:tblPr>
-      <w:tblGrid>
-        <w:gridCol w:w="2700"/>
-        <w:gridCol w:w="2700"/>
-        <w:gridCol w:w="2700"/>
-        <w:gridCol w:w="2700"/>
-      </w:tblGrid>
-      <w:tr>
-        <w:tc>
-          <w:tcPr>
-            <w:tcW w:type="dxa" w:w="2700"/>
-            <w:vAlign w:val="top"/>
-            <w:shd w:fill="FFFFFF"/>
-            <w:tcBorders>
-              <w:top w:val="single" w:sz="8" w:space="0" w:color="DCE6F2"/>
-              <w:left w:val="single" w:sz="8" w:space="0" w:color="DCE6F2"/>
-              <w:bottom w:val="single" w:sz="8" w:space="0" w:color="DCE6F2"/>
-              <w:right w:val="single" w:sz="8" w:space="0" w:color="DCE6F2"/>
-            </w:tcBorders>
-          </w:tcPr>
-          <w:p>
-            <w:pPr>
-              <w:spacing w:after="40"/>
-            </w:pPr>
-            <w:r>
-              <w:drawing>
-                <wp:inline xmlns:a="http://schemas.openxmlformats.org/drawingml/2006/main" xmlns:pic="http://schemas.openxmlformats.org/drawingml/2006/picture">
-                  <wp:extent cx="182880" cy="182880"/>
-                  <wp:docPr id="5" name="Picture 5"/>
-                  <wp:cNvGraphicFramePr>
-                    <a:graphicFrameLocks noChangeAspect="1"/>
-                  </wp:cNvGraphicFramePr>
-                  <a:graphic>
-                    <a:graphicData uri="http://schemas.openxmlformats.org/drawingml/2006/picture">
-                      <pic:pic>
-                        <pic:nvPicPr>
-                          <pic:cNvPr id="0" name="googlecloud.png"/>
-                          <pic:cNvPicPr/>
-                        </pic:nvPicPr>
-                        <pic:blipFill>
-                          <a:blip r:embed="rId13"/>
-                          <a:stretch>
-                            <a:fillRect/>
-                          </a:stretch>
-                        </pic:blipFill>
-                        <pic:spPr>
-                          <a:xfrm>
-                            <a:off x="0" y="0"/>
-                            <a:ext cx="182880" cy="182880"/>
-                          </a:xfrm>
-                          <a:prstGeom prst="rect"/>
-                        </pic:spPr>
-                      </pic:pic>
-                    </a:graphicData>
-                  </a:graphic>
-                </wp:inline>
-              </w:drawing>
-            </w:r>
-            <w:r>
-              <w:t xml:space="preserve"> </w:t>
-            </w:r>
-            <w:r>
-              <w:rPr>
-                <w:rFonts w:ascii="Aptos" w:hAnsi="Aptos"/>
-                <w:b/>
-                <w:color w:val="253044"/>
-                <w:sz w:val="17"/>
-              </w:rPr>
-              <w:t>Google Cloud</w:t>
-            </w:r>
-          </w:p>
-        </w:tc>
-        <w:tc>
-          <w:tcPr>
-            <w:tcW w:type="dxa" w:w="2700"/>
-            <w:vAlign w:val="top"/>
-            <w:shd w:fill="FFFFFF"/>
-            <w:tcBorders>
-              <w:top w:val="single" w:sz="8" w:space="0" w:color="DCE6F2"/>
-              <w:left w:val="single" w:sz="8" w:space="0" w:color="DCE6F2"/>
-              <w:bottom w:val="single" w:sz="8" w:space="0" w:color="DCE6F2"/>
-              <w:right w:val="single" w:sz="8" w:space="0" w:color="DCE6F2"/>
-            </w:tcBorders>
-          </w:tcPr>
-          <w:p>
-            <w:pPr>
-              <w:spacing w:after="40"/>
-            </w:pPr>
-            <w:r>
-              <w:drawing>
-                <wp:inline xmlns:a="http://schemas.openxmlformats.org/drawingml/2006/main" xmlns:pic="http://schemas.openxmlformats.org/drawingml/2006/picture">
-                  <wp:extent cx="182880" cy="182880"/>
-                  <wp:docPr id="6" name="Picture 6"/>
-                  <wp:cNvGraphicFramePr>
-                    <a:graphicFrameLocks noChangeAspect="1"/>
-                  </wp:cNvGraphicFramePr>
-                  <a:graphic>
-                    <a:graphicData uri="http://schemas.openxmlformats.org/drawingml/2006/picture">
-                      <pic:pic>
-                        <pic:nvPicPr>
-                          <pic:cNvPr id="0" name="aws.png"/>
-                          <pic:cNvPicPr/>
-                        </pic:nvPicPr>
-                        <pic:blipFill>
-                          <a:blip r:embed="rId9"/>
-                          <a:stretch>
-                            <a:fillRect/>
-                          </a:stretch>
-                        </pic:blipFill>
-                        <pic:spPr>
-                          <a:xfrm>
-                            <a:off x="0" y="0"/>
-                            <a:ext cx="182880" cy="182880"/>
-                          </a:xfrm>
-                          <a:prstGeom prst="rect"/>
-                        </pic:spPr>
-                      </pic:pic>
-                    </a:graphicData>
-                  </a:graphic>
-                </wp:inline>
-              </w:drawing>
-            </w:r>
-            <w:r>
-              <w:t xml:space="preserve"> </w:t>
-            </w:r>
-            <w:r>
-              <w:rPr>
-                <w:rFonts w:ascii="Aptos" w:hAnsi="Aptos"/>
-                <w:b/>
-                <w:color w:val="253044"/>
-                <w:sz w:val="17"/>
-              </w:rPr>
-              <w:t>AWS</w:t>
-            </w:r>
-          </w:p>
-        </w:tc>
-        <w:tc>
-          <w:tcPr>
-            <w:tcW w:type="dxa" w:w="2700"/>
-            <w:vAlign w:val="top"/>
-            <w:shd w:fill="FFFFFF"/>
-            <w:tcBorders>
-              <w:top w:val="single" w:sz="8" w:space="0" w:color="DCE6F2"/>
-              <w:left w:val="single" w:sz="8" w:space="0" w:color="DCE6F2"/>
-              <w:bottom w:val="single" w:sz="8" w:space="0" w:color="DCE6F2"/>
-              <w:right w:val="single" w:sz="8" w:space="0" w:color="DCE6F2"/>
-            </w:tcBorders>
-          </w:tcPr>
-          <w:p>
-            <w:pPr>
-              <w:spacing w:after="40"/>
-            </w:pPr>
-            <w:r>
-              <w:drawing>
-                <wp:inline xmlns:a="http://schemas.openxmlformats.org/drawingml/2006/main" xmlns:pic="http://schemas.openxmlformats.org/drawingml/2006/picture">
-                  <wp:extent cx="182880" cy="182880"/>
-                  <wp:docPr id="7" name="Picture 7"/>
-                  <wp:cNvGraphicFramePr>
-                    <a:graphicFrameLocks noChangeAspect="1"/>
-                  </wp:cNvGraphicFramePr>
-                  <a:graphic>
-                    <a:graphicData uri="http://schemas.openxmlformats.org/drawingml/2006/picture">
-                      <pic:pic>
-                        <pic:nvPicPr>
-                          <pic:cNvPr id="0" name="docker.png"/>
-                          <pic:cNvPicPr/>
-                        </pic:nvPicPr>
-                        <pic:blipFill>
-                          <a:blip r:embed="rId14"/>
-                          <a:stretch>
-                            <a:fillRect/>
-                          </a:stretch>
-                        </pic:blipFill>
-                        <pic:spPr>
-                          <a:xfrm>
-                            <a:off x="0" y="0"/>
-                            <a:ext cx="182880" cy="182880"/>
-                          </a:xfrm>
-                          <a:prstGeom prst="rect"/>
-                        </pic:spPr>
-                      </pic:pic>
-                    </a:graphicData>
-                  </a:graphic>
-                </wp:inline>
-              </w:drawing>
-            </w:r>
-            <w:r>
-              <w:t xml:space="preserve"> </w:t>
-            </w:r>
-            <w:r>
-              <w:rPr>
-                <w:rFonts w:ascii="Aptos" w:hAnsi="Aptos"/>
-                <w:b/>
-                <w:color w:val="253044"/>
-                <w:sz w:val="17"/>
-              </w:rPr>
-              <w:t>Docker</w:t>
-            </w:r>
-          </w:p>
-        </w:tc>
-        <w:tc>
-          <w:tcPr>
-            <w:tcW w:type="dxa" w:w="2700"/>
-            <w:vAlign w:val="top"/>
-            <w:shd w:fill="FFFFFF"/>
-            <w:tcBorders>
-              <w:top w:val="single" w:sz="8" w:space="0" w:color="DCE6F2"/>
-              <w:left w:val="single" w:sz="8" w:space="0" w:color="DCE6F2"/>
-              <w:bottom w:val="single" w:sz="8" w:space="0" w:color="DCE6F2"/>
-              <w:right w:val="single" w:sz="8" w:space="0" w:color="DCE6F2"/>
-            </w:tcBorders>
-          </w:tcPr>
-          <w:p>
-            <w:pPr>
-              <w:spacing w:after="40"/>
-            </w:pPr>
-            <w:r>
-              <w:drawing>
-                <wp:inline xmlns:a="http://schemas.openxmlformats.org/drawingml/2006/main" xmlns:pic="http://schemas.openxmlformats.org/drawingml/2006/picture">
-                  <wp:extent cx="182880" cy="182880"/>
-                  <wp:docPr id="8" name="Picture 8"/>
-                  <wp:cNvGraphicFramePr>
-                    <a:graphicFrameLocks noChangeAspect="1"/>
-                  </wp:cNvGraphicFramePr>
-                  <a:graphic>
-                    <a:graphicData uri="http://schemas.openxmlformats.org/drawingml/2006/picture">
-                      <pic:pic>
-                        <pic:nvPicPr>
-                          <pic:cNvPr id="0" name="kubernetes.png"/>
-                          <pic:cNvPicPr/>
-                        </pic:nvPicPr>
-                        <pic:blipFill>
-                          <a:blip r:embed="rId15"/>
-                          <a:stretch>
-                            <a:fillRect/>
-                          </a:stretch>
-                        </pic:blipFill>
-                        <pic:spPr>
-                          <a:xfrm>
-                            <a:off x="0" y="0"/>
-                            <a:ext cx="182880" cy="182880"/>
-                          </a:xfrm>
-                          <a:prstGeom prst="rect"/>
-                        </pic:spPr>
-                      </pic:pic>
-                    </a:graphicData>
-                  </a:graphic>
-                </wp:inline>
-              </w:drawing>
-            </w:r>
-            <w:r>
-              <w:t xml:space="preserve"> </w:t>
-            </w:r>
-            <w:r>
-              <w:rPr>
-                <w:rFonts w:ascii="Aptos" w:hAnsi="Aptos"/>
-                <w:b/>
-                <w:color w:val="253044"/>
-                <w:sz w:val="17"/>
-              </w:rPr>
-              <w:t>Kubernetes</w:t>
-            </w:r>
-          </w:p>
-        </w:tc>
-      </w:tr>
-      <w:tr>
-        <w:tc>
-          <w:tcPr>
-            <w:tcW w:type="dxa" w:w="2700"/>
-            <w:vAlign w:val="top"/>
-            <w:shd w:fill="FFFFFF"/>
-            <w:tcBorders>
-              <w:top w:val="single" w:sz="8" w:space="0" w:color="DCE6F2"/>
-              <w:left w:val="single" w:sz="8" w:space="0" w:color="DCE6F2"/>
-              <w:bottom w:val="single" w:sz="8" w:space="0" w:color="DCE6F2"/>
-              <w:right w:val="single" w:sz="8" w:space="0" w:color="DCE6F2"/>
-            </w:tcBorders>
-          </w:tcPr>
-          <w:p>
-            <w:pPr>
-              <w:spacing w:after="40"/>
-            </w:pPr>
-            <w:r>
-              <w:drawing>
-                <wp:inline xmlns:a="http://schemas.openxmlformats.org/drawingml/2006/main" xmlns:pic="http://schemas.openxmlformats.org/drawingml/2006/picture">
-                  <wp:extent cx="182880" cy="182880"/>
-                  <wp:docPr id="9" name="Picture 9"/>
-                  <wp:cNvGraphicFramePr>
-                    <a:graphicFrameLocks noChangeAspect="1"/>
-                  </wp:cNvGraphicFramePr>
-                  <a:graphic>
-                    <a:graphicData uri="http://schemas.openxmlformats.org/drawingml/2006/picture">
-                      <pic:pic>
-                        <pic:nvPicPr>
-                          <pic:cNvPr id="0" name="terraform.png"/>
-                          <pic:cNvPicPr/>
-                        </pic:nvPicPr>
-                        <pic:blipFill>
-                          <a:blip r:embed="rId12"/>
-                          <a:stretch>
-                            <a:fillRect/>
-                          </a:stretch>
-                        </pic:blipFill>
-                        <pic:spPr>
-                          <a:xfrm>
-                            <a:off x="0" y="0"/>
-                            <a:ext cx="182880" cy="182880"/>
-                          </a:xfrm>
-                          <a:prstGeom prst="rect"/>
-                        </pic:spPr>
-                      </pic:pic>
-                    </a:graphicData>
-                  </a:graphic>
-                </wp:inline>
-              </w:drawing>
-            </w:r>
-            <w:r>
-              <w:t xml:space="preserve"> </w:t>
-            </w:r>
-            <w:r>
-              <w:rPr>
-                <w:rFonts w:ascii="Aptos" w:hAnsi="Aptos"/>
-                <w:b/>
-                <w:color w:val="253044"/>
-                <w:sz w:val="17"/>
-              </w:rPr>
-              <w:t>Terraform</w:t>
-            </w:r>
-          </w:p>
-        </w:tc>
-        <w:tc>
-          <w:tcPr>
-            <w:tcW w:type="dxa" w:w="2700"/>
-            <w:vAlign w:val="top"/>
-            <w:shd w:fill="FFFFFF"/>
-            <w:tcBorders>
-              <w:top w:val="single" w:sz="8" w:space="0" w:color="DCE6F2"/>
-              <w:left w:val="single" w:sz="8" w:space="0" w:color="DCE6F2"/>
-              <w:bottom w:val="single" w:sz="8" w:space="0" w:color="DCE6F2"/>
-              <w:right w:val="single" w:sz="8" w:space="0" w:color="DCE6F2"/>
-            </w:tcBorders>
-          </w:tcPr>
-          <w:p>
-            <w:pPr>
-              <w:spacing w:after="40"/>
-            </w:pPr>
-            <w:r>
-              <w:drawing>
-                <wp:inline xmlns:a="http://schemas.openxmlformats.org/drawingml/2006/main" xmlns:pic="http://schemas.openxmlformats.org/drawingml/2006/picture">
-                  <wp:extent cx="182880" cy="182880"/>
-                  <wp:docPr id="10" name="Picture 10"/>
-                  <wp:cNvGraphicFramePr>
-                    <a:graphicFrameLocks noChangeAspect="1"/>
-                  </wp:cNvGraphicFramePr>
-                  <a:graphic>
-                    <a:graphicData uri="http://schemas.openxmlformats.org/drawingml/2006/picture">
-                      <pic:pic>
-                        <pic:nvPicPr>
-                          <pic:cNvPr id="0" name="linux.png"/>
-                          <pic:cNvPicPr/>
-                        </pic:nvPicPr>
-                        <pic:blipFill>
-                          <a:blip r:embed="rId11"/>
-                          <a:stretch>
-                            <a:fillRect/>
-                          </a:stretch>
-                        </pic:blipFill>
-                        <pic:spPr>
-                          <a:xfrm>
-                            <a:off x="0" y="0"/>
-                            <a:ext cx="182880" cy="182880"/>
-                          </a:xfrm>
-                          <a:prstGeom prst="rect"/>
-                        </pic:spPr>
-                      </pic:pic>
-                    </a:graphicData>
-                  </a:graphic>
-                </wp:inline>
-              </w:drawing>
-            </w:r>
-            <w:r>
-              <w:t xml:space="preserve"> </w:t>
-            </w:r>
-            <w:r>
-              <w:rPr>
-                <w:rFonts w:ascii="Aptos" w:hAnsi="Aptos"/>
-                <w:b/>
-                <w:color w:val="253044"/>
-                <w:sz w:val="17"/>
-              </w:rPr>
-              <w:t>Linux</w:t>
-            </w:r>
-          </w:p>
-        </w:tc>
-        <w:tc>
-          <w:tcPr>
-            <w:tcW w:type="dxa" w:w="2700"/>
-            <w:vAlign w:val="top"/>
-            <w:shd w:fill="FFFFFF"/>
-            <w:tcBorders>
-              <w:top w:val="single" w:sz="8" w:space="0" w:color="DCE6F2"/>
-              <w:left w:val="single" w:sz="8" w:space="0" w:color="DCE6F2"/>
-              <w:bottom w:val="single" w:sz="8" w:space="0" w:color="DCE6F2"/>
-              <w:right w:val="single" w:sz="8" w:space="0" w:color="DCE6F2"/>
-            </w:tcBorders>
-          </w:tcPr>
-          <w:p>
-            <w:pPr>
-              <w:spacing w:after="40"/>
-            </w:pPr>
-            <w:r>
-              <w:drawing>
-                <wp:inline xmlns:a="http://schemas.openxmlformats.org/drawingml/2006/main" xmlns:pic="http://schemas.openxmlformats.org/drawingml/2006/picture">
-                  <wp:extent cx="182880" cy="182880"/>
-                  <wp:docPr id="11" name="Picture 11"/>
-                  <wp:cNvGraphicFramePr>
-                    <a:graphicFrameLocks noChangeAspect="1"/>
-                  </wp:cNvGraphicFramePr>
-                  <a:graphic>
-                    <a:graphicData uri="http://schemas.openxmlformats.org/drawingml/2006/picture">
-                      <pic:pic>
-                        <pic:nvPicPr>
-                          <pic:cNvPr id="0" name="git.png"/>
-                          <pic:cNvPicPr/>
-                        </pic:nvPicPr>
-                        <pic:blipFill>
-                          <a:blip r:embed="rId16"/>
-                          <a:stretch>
-                            <a:fillRect/>
-                          </a:stretch>
-                        </pic:blipFill>
-                        <pic:spPr>
-                          <a:xfrm>
-                            <a:off x="0" y="0"/>
-                            <a:ext cx="182880" cy="182880"/>
-                          </a:xfrm>
-                          <a:prstGeom prst="rect"/>
-                        </pic:spPr>
-                      </pic:pic>
-                    </a:graphicData>
-                  </a:graphic>
-                </wp:inline>
-              </w:drawing>
-            </w:r>
-            <w:r>
-              <w:t xml:space="preserve"> </w:t>
-            </w:r>
-            <w:r>
-              <w:rPr>
-                <w:rFonts w:ascii="Aptos" w:hAnsi="Aptos"/>
-                <w:b/>
-                <w:color w:val="253044"/>
-                <w:sz w:val="17"/>
-              </w:rPr>
-              <w:t>Git</w:t>
-            </w:r>
-          </w:p>
-        </w:tc>
-        <w:tc>
-          <w:tcPr>
-            <w:tcW w:type="dxa" w:w="2700"/>
-            <w:vAlign w:val="top"/>
-            <w:shd w:fill="FFFFFF"/>
-            <w:tcBorders>
-              <w:top w:val="single" w:sz="8" w:space="0" w:color="DCE6F2"/>
-              <w:left w:val="single" w:sz="8" w:space="0" w:color="DCE6F2"/>
-              <w:bottom w:val="single" w:sz="8" w:space="0" w:color="DCE6F2"/>
-              <w:right w:val="single" w:sz="8" w:space="0" w:color="DCE6F2"/>
-            </w:tcBorders>
-          </w:tcPr>
-          <w:p>
-            <w:pPr>
-              <w:spacing w:after="40"/>
-            </w:pPr>
-            <w:r>
-              <w:drawing>
-                <wp:inline xmlns:a="http://schemas.openxmlformats.org/drawingml/2006/main" xmlns:pic="http://schemas.openxmlformats.org/drawingml/2006/picture">
-                  <wp:extent cx="182880" cy="182880"/>
-                  <wp:docPr id="12" name="Picture 12"/>
-                  <wp:cNvGraphicFramePr>
-                    <a:graphicFrameLocks noChangeAspect="1"/>
-                  </wp:cNvGraphicFramePr>
-                  <a:graphic>
-                    <a:graphicData uri="http://schemas.openxmlformats.org/drawingml/2006/picture">
-                      <pic:pic>
-                        <pic:nvPicPr>
-                          <pic:cNvPr id="0" name="python.png"/>
-                          <pic:cNvPicPr/>
-                        </pic:nvPicPr>
-                        <pic:blipFill>
-                          <a:blip r:embed="rId17"/>
-                          <a:stretch>
-                            <a:fillRect/>
-                          </a:stretch>
-                        </pic:blipFill>
-                        <pic:spPr>
-                          <a:xfrm>
-                            <a:off x="0" y="0"/>
-                            <a:ext cx="182880" cy="182880"/>
-                          </a:xfrm>
-                          <a:prstGeom prst="rect"/>
-                        </pic:spPr>
-                      </pic:pic>
-                    </a:graphicData>
-                  </a:graphic>
-                </wp:inline>
-              </w:drawing>
-            </w:r>
-            <w:r>
-              <w:t xml:space="preserve"> </w:t>
-            </w:r>
-            <w:r>
-              <w:rPr>
-                <w:rFonts w:ascii="Aptos" w:hAnsi="Aptos"/>
-                <w:b/>
-                <w:color w:val="253044"/>
-                <w:sz w:val="17"/>
-              </w:rPr>
-              <w:t>Python</w:t>
-            </w:r>
-          </w:p>
-        </w:tc>
-      </w:tr>
-      <w:tr>
-        <w:tc>
-          <w:tcPr>
-            <w:tcW w:type="dxa" w:w="2700"/>
-            <w:vAlign w:val="top"/>
-            <w:shd w:fill="FFFFFF"/>
-            <w:tcBorders>
-              <w:top w:val="single" w:sz="8" w:space="0" w:color="DCE6F2"/>
-              <w:left w:val="single" w:sz="8" w:space="0" w:color="DCE6F2"/>
-              <w:bottom w:val="single" w:sz="8" w:space="0" w:color="DCE6F2"/>
-              <w:right w:val="single" w:sz="8" w:space="0" w:color="DCE6F2"/>
-            </w:tcBorders>
-          </w:tcPr>
-          <w:p>
-            <w:pPr>
-              <w:spacing w:after="40"/>
-            </w:pPr>
-            <w:r>
-              <w:drawing>
-                <wp:inline xmlns:a="http://schemas.openxmlformats.org/drawingml/2006/main" xmlns:pic="http://schemas.openxmlformats.org/drawingml/2006/picture">
-                  <wp:extent cx="182880" cy="182880"/>
-                  <wp:docPr id="13" name="Picture 13"/>
-                  <wp:cNvGraphicFramePr>
-                    <a:graphicFrameLocks noChangeAspect="1"/>
-                  </wp:cNvGraphicFramePr>
-                  <a:graphic>
-                    <a:graphicData uri="http://schemas.openxmlformats.org/drawingml/2006/picture">
-                      <pic:pic>
-                        <pic:nvPicPr>
-                          <pic:cNvPr id="0" name="java.png"/>
-                          <pic:cNvPicPr/>
-                        </pic:nvPicPr>
-                        <pic:blipFill>
-                          <a:blip r:embed="rId18"/>
-                          <a:stretch>
-                            <a:fillRect/>
-                          </a:stretch>
-                        </pic:blipFill>
-                        <pic:spPr>
-                          <a:xfrm>
-                            <a:off x="0" y="0"/>
-                            <a:ext cx="182880" cy="182880"/>
-                          </a:xfrm>
-                          <a:prstGeom prst="rect"/>
-                        </pic:spPr>
-                      </pic:pic>
-                    </a:graphicData>
-                  </a:graphic>
-                </wp:inline>
-              </w:drawing>
-            </w:r>
-            <w:r>
-              <w:t xml:space="preserve"> </w:t>
-            </w:r>
-            <w:r>
-              <w:rPr>
-                <w:rFonts w:ascii="Aptos" w:hAnsi="Aptos"/>
-                <w:b/>
-                <w:color w:val="253044"/>
-                <w:sz w:val="17"/>
-              </w:rPr>
-              <w:t>Java</w:t>
-            </w:r>
-          </w:p>
-        </w:tc>
-        <w:tc>
-          <w:tcPr>
-            <w:tcW w:type="dxa" w:w="2700"/>
-            <w:vAlign w:val="top"/>
-            <w:shd w:fill="FFFFFF"/>
-            <w:tcBorders>
-              <w:top w:val="single" w:sz="8" w:space="0" w:color="DCE6F2"/>
-              <w:left w:val="single" w:sz="8" w:space="0" w:color="DCE6F2"/>
-              <w:bottom w:val="single" w:sz="8" w:space="0" w:color="DCE6F2"/>
-              <w:right w:val="single" w:sz="8" w:space="0" w:color="DCE6F2"/>
-            </w:tcBorders>
-          </w:tcPr>
-          <w:p>
-            <w:pPr>
-              <w:spacing w:after="40"/>
-            </w:pPr>
-            <w:r>
-              <w:drawing>
-                <wp:inline xmlns:a="http://schemas.openxmlformats.org/drawingml/2006/main" xmlns:pic="http://schemas.openxmlformats.org/drawingml/2006/picture">
-                  <wp:extent cx="182880" cy="182880"/>
-                  <wp:docPr id="14" name="Picture 14"/>
-                  <wp:cNvGraphicFramePr>
-                    <a:graphicFrameLocks noChangeAspect="1"/>
-                  </wp:cNvGraphicFramePr>
-                  <a:graphic>
-                    <a:graphicData uri="http://schemas.openxmlformats.org/drawingml/2006/picture">
-                      <pic:pic>
-                        <pic:nvPicPr>
-                          <pic:cNvPr id="0" name="postgresql.png"/>
-                          <pic:cNvPicPr/>
-                        </pic:nvPicPr>
-                        <pic:blipFill>
-                          <a:blip r:embed="rId19"/>
-                          <a:stretch>
-                            <a:fillRect/>
-                          </a:stretch>
-                        </pic:blipFill>
-                        <pic:spPr>
-                          <a:xfrm>
-                            <a:off x="0" y="0"/>
-                            <a:ext cx="182880" cy="182880"/>
-                          </a:xfrm>
-                          <a:prstGeom prst="rect"/>
-                        </pic:spPr>
-                      </pic:pic>
-                    </a:graphicData>
-                  </a:graphic>
-                </wp:inline>
-              </w:drawing>
-            </w:r>
-            <w:r>
-              <w:t xml:space="preserve"> </w:t>
-            </w:r>
-            <w:r>
-              <w:rPr>
-                <w:rFonts w:ascii="Aptos" w:hAnsi="Aptos"/>
-                <w:b/>
-                <w:color w:val="253044"/>
-                <w:sz w:val="17"/>
-              </w:rPr>
-              <w:t>PostgreSQL</w:t>
-            </w:r>
-          </w:p>
-        </w:tc>
-        <w:tc>
-          <w:tcPr>
-            <w:tcW w:type="dxa" w:w="2700"/>
-            <w:vAlign w:val="top"/>
-            <w:shd w:fill="FFFFFF"/>
-            <w:tcBorders>
-              <w:top w:val="single" w:sz="8" w:space="0" w:color="DCE6F2"/>
-              <w:left w:val="single" w:sz="8" w:space="0" w:color="DCE6F2"/>
-              <w:bottom w:val="single" w:sz="8" w:space="0" w:color="DCE6F2"/>
-              <w:right w:val="single" w:sz="8" w:space="0" w:color="DCE6F2"/>
-            </w:tcBorders>
-          </w:tcPr>
-          <w:p>
-            <w:pPr>
-              <w:spacing w:after="40"/>
-            </w:pPr>
-            <w:r>
-              <w:drawing>
-                <wp:inline xmlns:a="http://schemas.openxmlformats.org/drawingml/2006/main" xmlns:pic="http://schemas.openxmlformats.org/drawingml/2006/picture">
-                  <wp:extent cx="182880" cy="182880"/>
-                  <wp:docPr id="15" name="Picture 15"/>
-                  <wp:cNvGraphicFramePr>
-                    <a:graphicFrameLocks noChangeAspect="1"/>
-                  </wp:cNvGraphicFramePr>
-                  <a:graphic>
-                    <a:graphicData uri="http://schemas.openxmlformats.org/drawingml/2006/picture">
-                      <pic:pic>
-                        <pic:nvPicPr>
-                          <pic:cNvPr id="0" name="fastapi.png"/>
-                          <pic:cNvPicPr/>
-                        </pic:nvPicPr>
-                        <pic:blipFill>
-                          <a:blip r:embed="rId20"/>
-                          <a:stretch>
-                            <a:fillRect/>
-                          </a:stretch>
-                        </pic:blipFill>
-                        <pic:spPr>
-                          <a:xfrm>
-                            <a:off x="0" y="0"/>
-                            <a:ext cx="182880" cy="182880"/>
-                          </a:xfrm>
-                          <a:prstGeom prst="rect"/>
-                        </pic:spPr>
-                      </pic:pic>
-                    </a:graphicData>
-                  </a:graphic>
-                </wp:inline>
-              </w:drawing>
-            </w:r>
-            <w:r>
-              <w:t xml:space="preserve"> </w:t>
-            </w:r>
-            <w:r>
-              <w:rPr>
-                <w:rFonts w:ascii="Aptos" w:hAnsi="Aptos"/>
-                <w:b/>
-                <w:color w:val="253044"/>
-                <w:sz w:val="17"/>
-              </w:rPr>
-              <w:t>FastAPI</w:t>
-            </w:r>
-          </w:p>
-        </w:tc>
-        <w:tc>
-          <w:tcPr>
-            <w:tcW w:type="dxa" w:w="2700"/>
-            <w:vAlign w:val="top"/>
-            <w:shd w:fill="FFFFFF"/>
-            <w:tcBorders>
-              <w:top w:val="single" w:sz="8" w:space="0" w:color="DCE6F2"/>
-              <w:left w:val="single" w:sz="8" w:space="0" w:color="DCE6F2"/>
-              <w:bottom w:val="single" w:sz="8" w:space="0" w:color="DCE6F2"/>
-              <w:right w:val="single" w:sz="8" w:space="0" w:color="DCE6F2"/>
-            </w:tcBorders>
-          </w:tcPr>
-          <w:p>
-            <w:pPr>
-              <w:spacing w:after="40"/>
-            </w:pPr>
-            <w:r>
-              <w:drawing>
-                <wp:inline xmlns:a="http://schemas.openxmlformats.org/drawingml/2006/main" xmlns:pic="http://schemas.openxmlformats.org/drawingml/2006/picture">
-                  <wp:extent cx="182880" cy="182880"/>
-                  <wp:docPr id="16" name="Picture 16"/>
-                  <wp:cNvGraphicFramePr>
-                    <a:graphicFrameLocks noChangeAspect="1"/>
-                  </wp:cNvGraphicFramePr>
-                  <a:graphic>
-                    <a:graphicData uri="http://schemas.openxmlformats.org/drawingml/2006/picture">
-                      <pic:pic>
-                        <pic:nvPicPr>
-                          <pic:cNvPr id="0" name="postman.png"/>
-                          <pic:cNvPicPr/>
-                        </pic:nvPicPr>
-                        <pic:blipFill>
-                          <a:blip r:embed="rId21"/>
-                          <a:stretch>
-                            <a:fillRect/>
-                          </a:stretch>
-                        </pic:blipFill>
-                        <pic:spPr>
-                          <a:xfrm>
-                            <a:off x="0" y="0"/>
-                            <a:ext cx="182880" cy="182880"/>
-                          </a:xfrm>
-                          <a:prstGeom prst="rect"/>
-                        </pic:spPr>
-                      </pic:pic>
-                    </a:graphicData>
-                  </a:graphic>
-                </wp:inline>
-              </w:drawing>
-            </w:r>
-            <w:r>
-              <w:t xml:space="preserve"> </w:t>
-            </w:r>
-            <w:r>
-              <w:rPr>
-                <w:rFonts w:ascii="Aptos" w:hAnsi="Aptos"/>
-                <w:b/>
-                <w:color w:val="253044"/>
-                <w:sz w:val="17"/>
-              </w:rPr>
-              <w:t>Postman</w:t>
-            </w:r>
-          </w:p>
-        </w:tc>
-      </w:tr>
-    </w:tbl>
-    <w:p>
-      <w:pPr>
-        <w:spacing w:before="260" w:after="140"/>
-      </w:pPr>
-      <w:r>
-        <w:rPr>
-          <w:rFonts w:ascii="Aptos" w:hAnsi="Aptos"/>
-          <w:b/>
-          <w:color w:val="202124"/>
-          <w:sz w:val="21"/>
-        </w:rPr>
-        <w:t>PROFESSIONAL EXPERIENCE</w:t>
-      </w:r>
-    </w:p>
-    <w:tbl>
-      <w:tblPr>
-        <w:tblW w:type="auto" w:w="0"/>
-        <w:jc w:val="center"/>
-        <w:tblLayout w:type="autofit"/>
-        <w:tblLook w:firstColumn="1" w:firstRow="1" w:lastColumn="0" w:lastRow="0" w:noHBand="0" w:noVBand="1" w:val="04A0"/>
-      </w:tblPr>
-      <w:tblGrid>
-        <w:gridCol w:w="10800"/>
-      </w:tblGrid>
-      <w:tr>
-        <w:tc>
-          <w:tcPr>
-            <w:tcW w:type="dxa" w:w="10800"/>
-            <w:vAlign w:val="top"/>
-            <w:shd w:fill="FFFFFF"/>
-            <w:tcBorders>
-              <w:top w:val="single" w:sz="8" w:space="0" w:color="DCE6F2"/>
-              <w:left w:val="single" w:sz="8" w:space="0" w:color="DCE6F2"/>
-              <w:bottom w:val="single" w:sz="8" w:space="0" w:color="DCE6F2"/>
-              <w:right w:val="single" w:sz="8" w:space="0" w:color="DCE6F2"/>
-            </w:tcBorders>
-          </w:tcPr>
-          <w:p>
-            <w:pPr>
-              <w:spacing w:after="40"/>
-            </w:pPr>
-            <w:r>
-              <w:drawing>
-                <wp:inline xmlns:a="http://schemas.openxmlformats.org/drawingml/2006/main" xmlns:pic="http://schemas.openxmlformats.org/drawingml/2006/picture">
-                  <wp:extent cx="201168" cy="201168"/>
-                  <wp:docPr id="17" name="Picture 17"/>
-                  <wp:cNvGraphicFramePr>
-                    <a:graphicFrameLocks noChangeAspect="1"/>
-                  </wp:cNvGraphicFramePr>
-                  <a:graphic>
-                    <a:graphicData uri="http://schemas.openxmlformats.org/drawingml/2006/picture">
-                      <pic:pic>
-                        <pic:nvPicPr>
-                          <pic:cNvPr id="0" name="googlecloud.png"/>
-                          <pic:cNvPicPr/>
-                        </pic:nvPicPr>
-                        <pic:blipFill>
-                          <a:blip r:embed="rId13"/>
-                          <a:stretch>
-                            <a:fillRect/>
-                          </a:stretch>
-                        </pic:blipFill>
-                        <pic:spPr>
-                          <a:xfrm>
-                            <a:off x="0" y="0"/>
-                            <a:ext cx="201168" cy="201168"/>
-                          </a:xfrm>
-                          <a:prstGeom prst="rect"/>
-                        </pic:spPr>
-                      </pic:pic>
-                    </a:graphicData>
-                  </a:graphic>
-                </wp:inline>
-              </w:drawing>
-            </w:r>
-            <w:r>
-              <w:t xml:space="preserve"> </w:t>
-            </w:r>
-            <w:r>
-              <w:rPr>
-                <w:rFonts w:ascii="Aptos" w:hAnsi="Aptos"/>
-                <w:b/>
-                <w:color w:val="202124"/>
-                <w:sz w:val="20"/>
-              </w:rPr>
-              <w:t>Cloud Engineer Intern</w:t>
-            </w:r>
-            <w:r>
-              <w:rPr>
-                <w:rFonts w:ascii="Aptos" w:hAnsi="Aptos"/>
-                <w:b/>
-                <w:color w:val="1A73E8"/>
-                <w:sz w:val="17"/>
-              </w:rPr>
-              <w:t xml:space="preserve">  |  GCP + GKE</w:t>
-            </w:r>
-          </w:p>
-          <w:p>
-            <w:r>
-              <w:rPr>
-                <w:rFonts w:ascii="Aptos" w:hAnsi="Aptos"/>
-                <w:b w:val="0"/>
-                <w:color w:val="5F6368"/>
-                <w:sz w:val="17"/>
-              </w:rPr>
-              <w:t>Cloud Ambassadors, Google Cloud Partner | Jan 2026 - Present</w:t>
-            </w:r>
-          </w:p>
-          <w:p>
-            <w:pPr>
-              <w:pStyle w:val="ListBullet"/>
-              <w:spacing w:after="50"/>
-              <w:ind w:left="259"/>
-            </w:pPr>
-            <w:r>
-              <w:rPr>
-                <w:rFonts w:ascii="Aptos" w:hAnsi="Aptos"/>
-                <w:b w:val="0"/>
-                <w:color w:val="3C4043"/>
-                <w:sz w:val="17"/>
-              </w:rPr>
-              <w:t>Provisioned Compute Engine, Cloud Storage, IAM roles, VPC networks, firewall rules, and secure access policies.</w:t>
-            </w:r>
-          </w:p>
-          <w:p>
-            <w:pPr>
-              <w:pStyle w:val="ListBullet"/>
-              <w:spacing w:after="50"/>
-              <w:ind w:left="259"/>
-            </w:pPr>
-            <w:r>
-              <w:rPr>
-                <w:rFonts w:ascii="Aptos" w:hAnsi="Aptos"/>
-                <w:b w:val="0"/>
-                <w:color w:val="3C4043"/>
-                <w:sz w:val="17"/>
-              </w:rPr>
-              <w:t>Supported AWS and GCP tasks across VPC, IAM, DNS, load balancing, VPN, migration workflows, and troubleshooting.</w:t>
-            </w:r>
-          </w:p>
-          <w:p>
-            <w:pPr>
-              <w:pStyle w:val="ListBullet"/>
-              <w:spacing w:after="50"/>
-              <w:ind w:left="259"/>
-            </w:pPr>
-            <w:r>
-              <w:rPr>
-                <w:rFonts w:ascii="Aptos" w:hAnsi="Aptos"/>
-                <w:b w:val="0"/>
-                <w:color w:val="3C4043"/>
-                <w:sz w:val="17"/>
-              </w:rPr>
-              <w:t>Configured Cloud DNS and Route 53 records, HTTPS load balancer validation, and SSL/TLS certificate workflows.</w:t>
-            </w:r>
-          </w:p>
-          <w:p>
-            <w:pPr>
-              <w:pStyle w:val="ListBullet"/>
-              <w:spacing w:after="50"/>
-              <w:ind w:left="259"/>
-            </w:pPr>
-            <w:r>
-              <w:rPr>
-                <w:rFonts w:ascii="Aptos" w:hAnsi="Aptos"/>
-                <w:b w:val="0"/>
-                <w:color w:val="3C4043"/>
-                <w:sz w:val="17"/>
-              </w:rPr>
-              <w:t>Practiced Docker, Kubernetes/GKE, Artifact Registry, Cloud Run, Linux, Git, Bash, and Terraform fundamentals.</w:t>
-            </w:r>
-          </w:p>
-        </w:tc>
-      </w:tr>
-    </w:tbl>
-    <w:tbl>
-      <w:tblPr>
-        <w:tblW w:type="auto" w:w="0"/>
-        <w:jc w:val="center"/>
-        <w:tblLayout w:type="autofit"/>
-        <w:tblLook w:firstColumn="1" w:firstRow="1" w:lastColumn="0" w:lastRow="0" w:noHBand="0" w:noVBand="1" w:val="04A0"/>
-      </w:tblPr>
-      <w:tblGrid>
-        <w:gridCol w:w="10800"/>
-      </w:tblGrid>
-      <w:tr>
-        <w:tc>
-          <w:tcPr>
-            <w:tcW w:type="dxa" w:w="10800"/>
-            <w:vAlign w:val="top"/>
-            <w:shd w:fill="FFFFFF"/>
-            <w:tcBorders>
-              <w:top w:val="single" w:sz="8" w:space="0" w:color="DCE6F2"/>
-              <w:left w:val="single" w:sz="8" w:space="0" w:color="DCE6F2"/>
-              <w:bottom w:val="single" w:sz="8" w:space="0" w:color="DCE6F2"/>
-              <w:right w:val="single" w:sz="8" w:space="0" w:color="DCE6F2"/>
-            </w:tcBorders>
-          </w:tcPr>
-          <w:p>
-            <w:pPr>
-              <w:spacing w:after="40"/>
-            </w:pPr>
-            <w:r>
-              <w:drawing>
-                <wp:inline xmlns:a="http://schemas.openxmlformats.org/drawingml/2006/main" xmlns:pic="http://schemas.openxmlformats.org/drawingml/2006/picture">
-                  <wp:extent cx="201168" cy="201168"/>
-                  <wp:docPr id="18" name="Picture 18"/>
-                  <wp:cNvGraphicFramePr>
-                    <a:graphicFrameLocks noChangeAspect="1"/>
-                  </wp:cNvGraphicFramePr>
-                  <a:graphic>
-                    <a:graphicData uri="http://schemas.openxmlformats.org/drawingml/2006/picture">
-                      <pic:pic>
-                        <pic:nvPicPr>
-                          <pic:cNvPr id="0" name="python.png"/>
-                          <pic:cNvPicPr/>
-                        </pic:nvPicPr>
-                        <pic:blipFill>
-                          <a:blip r:embed="rId17"/>
-                          <a:stretch>
-                            <a:fillRect/>
-                          </a:stretch>
-                        </pic:blipFill>
-                        <pic:spPr>
-                          <a:xfrm>
-                            <a:off x="0" y="0"/>
-                            <a:ext cx="201168" cy="201168"/>
-                          </a:xfrm>
-                          <a:prstGeom prst="rect"/>
-                        </pic:spPr>
-                      </pic:pic>
-                    </a:graphicData>
-                  </a:graphic>
-                </wp:inline>
-              </w:drawing>
-            </w:r>
-            <w:r>
-              <w:t xml:space="preserve"> </w:t>
-            </w:r>
-            <w:r>
-              <w:rPr>
-                <w:rFonts w:ascii="Aptos" w:hAnsi="Aptos"/>
-                <w:b/>
-                <w:color w:val="202124"/>
-                <w:sz w:val="20"/>
-              </w:rPr>
-              <w:t>Backend Developer</w:t>
-            </w:r>
-            <w:r>
-              <w:rPr>
-                <w:rFonts w:ascii="Aptos" w:hAnsi="Aptos"/>
-                <w:b/>
-                <w:color w:val="1A73E8"/>
-                <w:sz w:val="17"/>
-              </w:rPr>
-              <w:t xml:space="preserve">  |  APIs + Linux</w:t>
-            </w:r>
-          </w:p>
-          <w:p>
-            <w:r>
-              <w:rPr>
-                <w:rFonts w:ascii="Aptos" w:hAnsi="Aptos"/>
-                <w:b w:val="0"/>
-                <w:color w:val="5F6368"/>
-                <w:sz w:val="17"/>
-              </w:rPr>
-              <w:t>Chella Corporations | Jul 2025 - Dec 2025</w:t>
-            </w:r>
-          </w:p>
-          <w:p>
-            <w:pPr>
-              <w:pStyle w:val="ListBullet"/>
-              <w:spacing w:after="50"/>
-              <w:ind w:left="259"/>
-            </w:pPr>
-            <w:r>
-              <w:rPr>
-                <w:rFonts w:ascii="Aptos" w:hAnsi="Aptos"/>
-                <w:b w:val="0"/>
-                <w:color w:val="3C4043"/>
-                <w:sz w:val="17"/>
-              </w:rPr>
-              <w:t>Developed REST APIs using Python and FastAPI for an AI-driven medical platform.</w:t>
-            </w:r>
-          </w:p>
-          <w:p>
-            <w:pPr>
-              <w:pStyle w:val="ListBullet"/>
-              <w:spacing w:after="50"/>
-              <w:ind w:left="259"/>
-            </w:pPr>
-            <w:r>
-              <w:rPr>
-                <w:rFonts w:ascii="Aptos" w:hAnsi="Aptos"/>
-                <w:b w:val="0"/>
-                <w:color w:val="3C4043"/>
-                <w:sz w:val="17"/>
-              </w:rPr>
-              <w:t>Worked with secure authentication, service integration, database integration, debugging, and API automation.</w:t>
-            </w:r>
-          </w:p>
-          <w:p>
-            <w:pPr>
-              <w:pStyle w:val="ListBullet"/>
-              <w:spacing w:after="50"/>
-              <w:ind w:left="259"/>
-            </w:pPr>
-            <w:r>
-              <w:rPr>
-                <w:rFonts w:ascii="Aptos" w:hAnsi="Aptos"/>
-                <w:b w:val="0"/>
-                <w:color w:val="3C4043"/>
-                <w:sz w:val="17"/>
-              </w:rPr>
-              <w:t>Deployed and maintained backend services on Linux servers, strengthening cloud operations readiness.</w:t>
-            </w:r>
-          </w:p>
-        </w:tc>
-      </w:tr>
-    </w:tbl>
-    <w:tbl>
-      <w:tblPr>
-        <w:tblW w:type="auto" w:w="0"/>
-        <w:jc w:val="center"/>
-        <w:tblLayout w:type="autofit"/>
-        <w:tblLook w:firstColumn="1" w:firstRow="1" w:lastColumn="0" w:lastRow="0" w:noHBand="0" w:noVBand="1" w:val="04A0"/>
-      </w:tblPr>
-      <w:tblGrid>
-        <w:gridCol w:w="10800"/>
-      </w:tblGrid>
-      <w:tr>
-        <w:tc>
-          <w:tcPr>
-            <w:tcW w:type="dxa" w:w="10800"/>
-            <w:vAlign w:val="top"/>
-            <w:shd w:fill="FFFFFF"/>
-            <w:tcBorders>
-              <w:top w:val="single" w:sz="8" w:space="0" w:color="DCE6F2"/>
-              <w:left w:val="single" w:sz="8" w:space="0" w:color="DCE6F2"/>
-              <w:bottom w:val="single" w:sz="8" w:space="0" w:color="DCE6F2"/>
-              <w:right w:val="single" w:sz="8" w:space="0" w:color="DCE6F2"/>
-            </w:tcBorders>
-          </w:tcPr>
-          <w:p>
-            <w:pPr>
-              <w:spacing w:after="40"/>
-            </w:pPr>
-            <w:r>
-              <w:drawing>
-                <wp:inline xmlns:a="http://schemas.openxmlformats.org/drawingml/2006/main" xmlns:pic="http://schemas.openxmlformats.org/drawingml/2006/picture">
-                  <wp:extent cx="201168" cy="201168"/>
-                  <wp:docPr id="19" name="Picture 19"/>
-                  <wp:cNvGraphicFramePr>
-                    <a:graphicFrameLocks noChangeAspect="1"/>
-                  </wp:cNvGraphicFramePr>
-                  <a:graphic>
-                    <a:graphicData uri="http://schemas.openxmlformats.org/drawingml/2006/picture">
-                      <pic:pic>
-                        <pic:nvPicPr>
-                          <pic:cNvPr id="0" name="infosys.png"/>
-                          <pic:cNvPicPr/>
-                        </pic:nvPicPr>
-                        <pic:blipFill>
-                          <a:blip r:embed="rId22"/>
-                          <a:stretch>
-                            <a:fillRect/>
-                          </a:stretch>
-                        </pic:blipFill>
-                        <pic:spPr>
-                          <a:xfrm>
-                            <a:off x="0" y="0"/>
-                            <a:ext cx="201168" cy="201168"/>
-                          </a:xfrm>
-                          <a:prstGeom prst="rect"/>
-                        </pic:spPr>
-                      </pic:pic>
-                    </a:graphicData>
-                  </a:graphic>
-                </wp:inline>
-              </w:drawing>
-            </w:r>
-            <w:r>
-              <w:t xml:space="preserve"> </w:t>
-            </w:r>
-            <w:r>
-              <w:rPr>
-                <w:rFonts w:ascii="Aptos" w:hAnsi="Aptos"/>
-                <w:b/>
-                <w:color w:val="202124"/>
-                <w:sz w:val="20"/>
-              </w:rPr>
-              <w:t>AI Application Developer Intern</w:t>
-            </w:r>
-            <w:r>
-              <w:rPr>
-                <w:rFonts w:ascii="Aptos" w:hAnsi="Aptos"/>
-                <w:b/>
-                <w:color w:val="1A73E8"/>
-                <w:sz w:val="17"/>
-              </w:rPr>
-              <w:t xml:space="preserve">  |  RAG System</w:t>
-            </w:r>
-          </w:p>
-          <w:p>
-            <w:r>
-              <w:rPr>
-                <w:rFonts w:ascii="Aptos" w:hAnsi="Aptos"/>
-                <w:b w:val="0"/>
-                <w:color w:val="5F6368"/>
-                <w:sz w:val="17"/>
-              </w:rPr>
-              <w:t>Infosys Springboard | Sep 2025 - Nov 2025</w:t>
-            </w:r>
-          </w:p>
-          <w:p>
-            <w:pPr>
-              <w:pStyle w:val="ListBullet"/>
-              <w:spacing w:after="50"/>
-              <w:ind w:left="259"/>
-            </w:pPr>
-            <w:r>
-              <w:rPr>
-                <w:rFonts w:ascii="Aptos" w:hAnsi="Aptos"/>
-                <w:b w:val="0"/>
-                <w:color w:val="3C4043"/>
-                <w:sz w:val="17"/>
-              </w:rPr>
-              <w:t>Built a RAG-based compliance checker system for document retrieval, analysis, scoring, and automated evaluation.</w:t>
-            </w:r>
-          </w:p>
-          <w:p>
-            <w:pPr>
-              <w:pStyle w:val="ListBullet"/>
-              <w:spacing w:after="50"/>
-              <w:ind w:left="259"/>
-            </w:pPr>
-            <w:r>
-              <w:rPr>
-                <w:rFonts w:ascii="Aptos" w:hAnsi="Aptos"/>
-                <w:b w:val="0"/>
-                <w:color w:val="3C4043"/>
-                <w:sz w:val="17"/>
-              </w:rPr>
-              <w:t>Integrated GPT-based workflows to improve compliance review efficiency by 70%.</w:t>
-            </w:r>
-          </w:p>
-        </w:tc>
-      </w:tr>
-    </w:tbl>
-    <w:p>
-      <w:r>
-        <w:br w:type="page"/>
-      </w:r>
-    </w:p>
-    <w:p>
-      <w:pPr>
-        <w:spacing w:before="260" w:after="140"/>
-      </w:pPr>
-      <w:r>
-        <w:rPr>
-          <w:rFonts w:ascii="Aptos" w:hAnsi="Aptos"/>
-          <w:b/>
-          <w:color w:val="202124"/>
-          <w:sz w:val="21"/>
-        </w:rPr>
-        <w:t>PROJECT HIGHLIGHTS</w:t>
-      </w:r>
-    </w:p>
-    <w:tbl>
-      <w:tblPr>
-        <w:tblW w:type="auto" w:w="0"/>
-        <w:jc w:val="center"/>
-        <w:tblLayout w:type="autofit"/>
-        <w:tblLook w:firstColumn="1" w:firstRow="1" w:lastColumn="0" w:lastRow="0" w:noHBand="0" w:noVBand="1" w:val="04A0"/>
-      </w:tblPr>
-      <w:tblGrid>
-        <w:gridCol w:w="10800"/>
-      </w:tblGrid>
-      <w:tr>
-        <w:tc>
-          <w:tcPr>
-            <w:tcW w:type="dxa" w:w="10800"/>
-            <w:vAlign w:val="top"/>
-            <w:shd w:fill="FFFFFF"/>
-            <w:tcBorders>
-              <w:top w:val="single" w:sz="8" w:space="0" w:color="DCE6F2"/>
-              <w:left w:val="single" w:sz="8" w:space="0" w:color="DCE6F2"/>
-              <w:bottom w:val="single" w:sz="8" w:space="0" w:color="DCE6F2"/>
-              <w:right w:val="single" w:sz="8" w:space="0" w:color="DCE6F2"/>
-            </w:tcBorders>
-          </w:tcPr>
-          <w:p>
-            <w:pPr>
-              <w:spacing w:after="40"/>
-            </w:pPr>
-            <w:r>
-              <w:drawing>
-                <wp:inline xmlns:a="http://schemas.openxmlformats.org/drawingml/2006/main" xmlns:pic="http://schemas.openxmlformats.org/drawingml/2006/picture">
-                  <wp:extent cx="182880" cy="182880"/>
-                  <wp:docPr id="20" name="Picture 20"/>
-                  <wp:cNvGraphicFramePr>
-                    <a:graphicFrameLocks noChangeAspect="1"/>
-                  </wp:cNvGraphicFramePr>
-                  <a:graphic>
-                    <a:graphicData uri="http://schemas.openxmlformats.org/drawingml/2006/picture">
-                      <pic:pic>
-                        <pic:nvPicPr>
-                          <pic:cNvPr id="0" name="aws.png"/>
-                          <pic:cNvPicPr/>
-                        </pic:nvPicPr>
-                        <pic:blipFill>
-                          <a:blip r:embed="rId9"/>
-                          <a:stretch>
-                            <a:fillRect/>
-                          </a:stretch>
-                        </pic:blipFill>
-                        <pic:spPr>
-                          <a:xfrm>
-                            <a:off x="0" y="0"/>
-                            <a:ext cx="182880" cy="182880"/>
-                          </a:xfrm>
-                          <a:prstGeom prst="rect"/>
-                        </pic:spPr>
-                      </pic:pic>
-                    </a:graphicData>
-                  </a:graphic>
-                </wp:inline>
-              </w:drawing>
-            </w:r>
-            <w:r>
-              <w:t xml:space="preserve"> </w:t>
-            </w:r>
-            <w:r>
-              <w:rPr>
-                <w:rFonts w:ascii="Aptos" w:hAnsi="Aptos"/>
-                <w:b/>
-                <w:color w:val="202124"/>
-                <w:sz w:val="19"/>
-              </w:rPr>
-              <w:t>AWS Route 53 to Google Cloud DNS Migration</w:t>
-            </w:r>
-          </w:p>
-          <w:p>
-            <w:r>
-              <w:rPr>
-                <w:rFonts w:ascii="Aptos" w:hAnsi="Aptos"/>
-                <w:b w:val="0"/>
-                <w:color w:val="3C4043"/>
-                <w:sz w:val="17"/>
-              </w:rPr>
-              <w:t>Zero-downtime domain migration with DNS inventory, Cloud DNS zone setup, record replication, NS cutover, validation, and rollback.</w:t>
-            </w:r>
-          </w:p>
-        </w:tc>
-      </w:tr>
-    </w:tbl>
-    <w:tbl>
-      <w:tblPr>
-        <w:tblW w:type="auto" w:w="0"/>
-        <w:jc w:val="center"/>
-        <w:tblLayout w:type="autofit"/>
-        <w:tblLook w:firstColumn="1" w:firstRow="1" w:lastColumn="0" w:lastRow="0" w:noHBand="0" w:noVBand="1" w:val="04A0"/>
-      </w:tblPr>
-      <w:tblGrid>
-        <w:gridCol w:w="10800"/>
-      </w:tblGrid>
-      <w:tr>
-        <w:tc>
-          <w:tcPr>
-            <w:tcW w:type="dxa" w:w="10800"/>
-            <w:vAlign w:val="top"/>
-            <w:shd w:fill="FFFFFF"/>
-            <w:tcBorders>
-              <w:top w:val="single" w:sz="8" w:space="0" w:color="DCE6F2"/>
-              <w:left w:val="single" w:sz="8" w:space="0" w:color="DCE6F2"/>
-              <w:bottom w:val="single" w:sz="8" w:space="0" w:color="DCE6F2"/>
-              <w:right w:val="single" w:sz="8" w:space="0" w:color="DCE6F2"/>
-            </w:tcBorders>
-          </w:tcPr>
-          <w:p>
-            <w:pPr>
-              <w:spacing w:after="40"/>
-            </w:pPr>
-            <w:r>
-              <w:drawing>
-                <wp:inline xmlns:a="http://schemas.openxmlformats.org/drawingml/2006/main" xmlns:pic="http://schemas.openxmlformats.org/drawingml/2006/picture">
-                  <wp:extent cx="182880" cy="182880"/>
-                  <wp:docPr id="21" name="Picture 21"/>
-                  <wp:cNvGraphicFramePr>
-                    <a:graphicFrameLocks noChangeAspect="1"/>
-                  </wp:cNvGraphicFramePr>
-                  <a:graphic>
-                    <a:graphicData uri="http://schemas.openxmlformats.org/drawingml/2006/picture">
-                      <pic:pic>
-                        <pic:nvPicPr>
-                          <pic:cNvPr id="0" name="postgresql.png"/>
-                          <pic:cNvPicPr/>
-                        </pic:nvPicPr>
-                        <pic:blipFill>
-                          <a:blip r:embed="rId19"/>
-                          <a:stretch>
-                            <a:fillRect/>
-                          </a:stretch>
-                        </pic:blipFill>
-                        <pic:spPr>
-                          <a:xfrm>
-                            <a:off x="0" y="0"/>
-                            <a:ext cx="182880" cy="182880"/>
-                          </a:xfrm>
-                          <a:prstGeom prst="rect"/>
-                        </pic:spPr>
-                      </pic:pic>
-                    </a:graphicData>
-                  </a:graphic>
-                </wp:inline>
-              </w:drawing>
-            </w:r>
-            <w:r>
-              <w:t xml:space="preserve"> </w:t>
-            </w:r>
-            <w:r>
-              <w:rPr>
-                <w:rFonts w:ascii="Aptos" w:hAnsi="Aptos"/>
-                <w:b/>
-                <w:color w:val="202124"/>
-                <w:sz w:val="19"/>
-              </w:rPr>
-              <w:t>Private AWS RDS PostgreSQL to GCP Cloud SQL Migration</w:t>
-            </w:r>
-          </w:p>
-          <w:p>
-            <w:r>
-              <w:rPr>
-                <w:rFonts w:ascii="Aptos" w:hAnsi="Aptos"/>
-                <w:b w:val="0"/>
-                <w:color w:val="3C4043"/>
-                <w:sz w:val="17"/>
-              </w:rPr>
-              <w:t>Private PostgreSQL migration using AWS VPC/VGW, GCP HA VPN, IPsec, BGP, Private Services Access, and DMS.</w:t>
-            </w:r>
-          </w:p>
-        </w:tc>
-      </w:tr>
-    </w:tbl>
-    <w:tbl>
-      <w:tblPr>
-        <w:tblW w:type="auto" w:w="0"/>
-        <w:jc w:val="center"/>
-        <w:tblLayout w:type="autofit"/>
-        <w:tblLook w:firstColumn="1" w:firstRow="1" w:lastColumn="0" w:lastRow="0" w:noHBand="0" w:noVBand="1" w:val="04A0"/>
-      </w:tblPr>
-      <w:tblGrid>
-        <w:gridCol w:w="10800"/>
-      </w:tblGrid>
-      <w:tr>
-        <w:tc>
-          <w:tcPr>
-            <w:tcW w:type="dxa" w:w="10800"/>
-            <w:vAlign w:val="top"/>
-            <w:shd w:fill="FFFFFF"/>
-            <w:tcBorders>
-              <w:top w:val="single" w:sz="8" w:space="0" w:color="DCE6F2"/>
-              <w:left w:val="single" w:sz="8" w:space="0" w:color="DCE6F2"/>
-              <w:bottom w:val="single" w:sz="8" w:space="0" w:color="DCE6F2"/>
-              <w:right w:val="single" w:sz="8" w:space="0" w:color="DCE6F2"/>
-            </w:tcBorders>
-          </w:tcPr>
-          <w:p>
-            <w:pPr>
-              <w:spacing w:after="40"/>
-            </w:pPr>
-            <w:r>
-              <w:drawing>
-                <wp:inline xmlns:a="http://schemas.openxmlformats.org/drawingml/2006/main" xmlns:pic="http://schemas.openxmlformats.org/drawingml/2006/picture">
-                  <wp:extent cx="182880" cy="182880"/>
-                  <wp:docPr id="22" name="Picture 22"/>
-                  <wp:cNvGraphicFramePr>
-                    <a:graphicFrameLocks noChangeAspect="1"/>
-                  </wp:cNvGraphicFramePr>
-                  <a:graphic>
-                    <a:graphicData uri="http://schemas.openxmlformats.org/drawingml/2006/picture">
-                      <pic:pic>
-                        <pic:nvPicPr>
-                          <pic:cNvPr id="0" name="googlecloud.png"/>
-                          <pic:cNvPicPr/>
-                        </pic:nvPicPr>
-                        <pic:blipFill>
-                          <a:blip r:embed="rId13"/>
-                          <a:stretch>
-                            <a:fillRect/>
-                          </a:stretch>
-                        </pic:blipFill>
-                        <pic:spPr>
-                          <a:xfrm>
-                            <a:off x="0" y="0"/>
-                            <a:ext cx="182880" cy="182880"/>
-                          </a:xfrm>
-                          <a:prstGeom prst="rect"/>
-                        </pic:spPr>
-                      </pic:pic>
-                    </a:graphicData>
-                  </a:graphic>
-                </wp:inline>
-              </w:drawing>
-            </w:r>
-            <w:r>
-              <w:t xml:space="preserve"> </w:t>
-            </w:r>
-            <w:r>
-              <w:rPr>
-                <w:rFonts w:ascii="Aptos" w:hAnsi="Aptos"/>
-                <w:b/>
-                <w:color w:val="202124"/>
-                <w:sz w:val="19"/>
-              </w:rPr>
-              <w:t>Private Cloud Storage Behind Load Balancer</w:t>
-            </w:r>
-          </w:p>
-          <w:p>
-            <w:r>
-              <w:rPr>
-                <w:rFonts w:ascii="Aptos" w:hAnsi="Aptos"/>
-                <w:b w:val="0"/>
-                <w:color w:val="3C4043"/>
-                <w:sz w:val="17"/>
-              </w:rPr>
-              <w:t>GCP private Cloud Storage access pattern using global external application load balancer and backend bucket validation.</w:t>
-            </w:r>
-          </w:p>
-        </w:tc>
-      </w:tr>
-    </w:tbl>
-    <w:tbl>
-      <w:tblPr>
-        <w:tblW w:type="auto" w:w="0"/>
-        <w:jc w:val="center"/>
-        <w:tblLayout w:type="autofit"/>
-        <w:tblLook w:firstColumn="1" w:firstRow="1" w:lastColumn="0" w:lastRow="0" w:noHBand="0" w:noVBand="1" w:val="04A0"/>
-      </w:tblPr>
-      <w:tblGrid>
-        <w:gridCol w:w="10800"/>
-      </w:tblGrid>
-      <w:tr>
-        <w:tc>
-          <w:tcPr>
-            <w:tcW w:type="dxa" w:w="10800"/>
-            <w:vAlign w:val="top"/>
-            <w:shd w:fill="FFFFFF"/>
-            <w:tcBorders>
-              <w:top w:val="single" w:sz="8" w:space="0" w:color="DCE6F2"/>
-              <w:left w:val="single" w:sz="8" w:space="0" w:color="DCE6F2"/>
-              <w:bottom w:val="single" w:sz="8" w:space="0" w:color="DCE6F2"/>
-              <w:right w:val="single" w:sz="8" w:space="0" w:color="DCE6F2"/>
-            </w:tcBorders>
-          </w:tcPr>
-          <w:p>
-            <w:pPr>
-              <w:spacing w:after="40"/>
-            </w:pPr>
-            <w:r>
-              <w:drawing>
-                <wp:inline xmlns:a="http://schemas.openxmlformats.org/drawingml/2006/main" xmlns:pic="http://schemas.openxmlformats.org/drawingml/2006/picture">
-                  <wp:extent cx="182880" cy="182880"/>
-                  <wp:docPr id="23" name="Picture 23"/>
-                  <wp:cNvGraphicFramePr>
-                    <a:graphicFrameLocks noChangeAspect="1"/>
-                  </wp:cNvGraphicFramePr>
-                  <a:graphic>
-                    <a:graphicData uri="http://schemas.openxmlformats.org/drawingml/2006/picture">
-                      <pic:pic>
-                        <pic:nvPicPr>
-                          <pic:cNvPr id="0" name="googlecloud.png"/>
-                          <pic:cNvPicPr/>
-                        </pic:nvPicPr>
-                        <pic:blipFill>
-                          <a:blip r:embed="rId13"/>
-                          <a:stretch>
-                            <a:fillRect/>
-                          </a:stretch>
-                        </pic:blipFill>
-                        <pic:spPr>
-                          <a:xfrm>
-                            <a:off x="0" y="0"/>
-                            <a:ext cx="182880" cy="182880"/>
-                          </a:xfrm>
-                          <a:prstGeom prst="rect"/>
-                        </pic:spPr>
-                      </pic:pic>
-                    </a:graphicData>
-                  </a:graphic>
-                </wp:inline>
-              </w:drawing>
-            </w:r>
-            <w:r>
-              <w:t xml:space="preserve"> </w:t>
-            </w:r>
-            <w:r>
-              <w:rPr>
-                <w:rFonts w:ascii="Aptos" w:hAnsi="Aptos"/>
-                <w:b/>
-                <w:color w:val="202124"/>
-                <w:sz w:val="19"/>
-              </w:rPr>
-              <w:t>AWS to GCP Site-to-Site VPN</w:t>
-            </w:r>
-          </w:p>
-          <w:p>
-            <w:r>
-              <w:rPr>
-                <w:rFonts w:ascii="Aptos" w:hAnsi="Aptos"/>
-                <w:b w:val="0"/>
-                <w:color w:val="3C4043"/>
-                <w:sz w:val="17"/>
-              </w:rPr>
-              <w:t>Hybrid cloud VPN documentation covering secure tunnel configuration, routing, validation, and connectivity checks.</w:t>
-            </w:r>
-          </w:p>
-        </w:tc>
-      </w:tr>
-    </w:tbl>
-    <w:tbl>
-      <w:tblPr>
-        <w:tblW w:type="auto" w:w="0"/>
-        <w:jc w:val="center"/>
-        <w:tblLayout w:type="autofit"/>
-        <w:tblLook w:firstColumn="1" w:firstRow="1" w:lastColumn="0" w:lastRow="0" w:noHBand="0" w:noVBand="1" w:val="04A0"/>
-      </w:tblPr>
-      <w:tblGrid>
-        <w:gridCol w:w="10800"/>
-      </w:tblGrid>
-      <w:tr>
-        <w:tc>
-          <w:tcPr>
-            <w:tcW w:type="dxa" w:w="10800"/>
-            <w:vAlign w:val="top"/>
-            <w:shd w:fill="FFFFFF"/>
-            <w:tcBorders>
-              <w:top w:val="single" w:sz="8" w:space="0" w:color="DCE6F2"/>
-              <w:left w:val="single" w:sz="8" w:space="0" w:color="DCE6F2"/>
-              <w:bottom w:val="single" w:sz="8" w:space="0" w:color="DCE6F2"/>
-              <w:right w:val="single" w:sz="8" w:space="0" w:color="DCE6F2"/>
-            </w:tcBorders>
-          </w:tcPr>
-          <w:p>
-            <w:pPr>
-              <w:spacing w:after="40"/>
-            </w:pPr>
-            <w:r>
-              <w:drawing>
-                <wp:inline xmlns:a="http://schemas.openxmlformats.org/drawingml/2006/main" xmlns:pic="http://schemas.openxmlformats.org/drawingml/2006/picture">
-                  <wp:extent cx="182880" cy="182880"/>
-                  <wp:docPr id="24" name="Picture 24"/>
-                  <wp:cNvGraphicFramePr>
-                    <a:graphicFrameLocks noChangeAspect="1"/>
-                  </wp:cNvGraphicFramePr>
-                  <a:graphic>
-                    <a:graphicData uri="http://schemas.openxmlformats.org/drawingml/2006/picture">
-                      <pic:pic>
-                        <pic:nvPicPr>
-                          <pic:cNvPr id="0" name="linux.png"/>
-                          <pic:cNvPicPr/>
-                        </pic:nvPicPr>
-                        <pic:blipFill>
-                          <a:blip r:embed="rId11"/>
-                          <a:stretch>
-                            <a:fillRect/>
-                          </a:stretch>
-                        </pic:blipFill>
-                        <pic:spPr>
-                          <a:xfrm>
-                            <a:off x="0" y="0"/>
-                            <a:ext cx="182880" cy="182880"/>
-                          </a:xfrm>
-                          <a:prstGeom prst="rect"/>
-                        </pic:spPr>
-                      </pic:pic>
-                    </a:graphicData>
-                  </a:graphic>
-                </wp:inline>
-              </w:drawing>
-            </w:r>
-            <w:r>
-              <w:t xml:space="preserve"> </w:t>
-            </w:r>
-            <w:r>
-              <w:rPr>
-                <w:rFonts w:ascii="Aptos" w:hAnsi="Aptos"/>
-                <w:b/>
-                <w:color w:val="202124"/>
-                <w:sz w:val="19"/>
-              </w:rPr>
-              <w:t>Forenscope - IoT Digital Evidence Collector</w:t>
-            </w:r>
-          </w:p>
-          <w:p>
-            <w:r>
-              <w:rPr>
-                <w:rFonts w:ascii="Aptos" w:hAnsi="Aptos"/>
-                <w:b w:val="0"/>
-                <w:color w:val="3C4043"/>
-                <w:sz w:val="17"/>
-              </w:rPr>
-              <w:t>IoT-driven evidence collection concept aligned to cybersecurity investigation, integrity, and secure handling workflows.</w:t>
-            </w:r>
-          </w:p>
-        </w:tc>
-      </w:tr>
-    </w:tbl>
-    <w:p>
-      <w:pPr>
-        <w:spacing w:before="260" w:after="140"/>
+        <w:spacing w:before="240" w:after="120"/>
       </w:pPr>
       <w:r>
         <w:rPr>
@@ -2126,7 +416,7 @@
                 <w:color w:val="3C4043"/>
                 <w:sz w:val="17"/>
               </w:rPr>
-              <w:t>AWS: IAM, EC2, S3, VPC, Route 53, RDS, ECR, ECS, CodePipeline. Google Cloud: IAM, Compute Engine, VPC, Cloud DNS, Cloud SQL, Cloud Storage, Cloud Run, GKE, Artifact Registry.</w:t>
+              <w:t>Amazon Web Services (AWS), Google Cloud Platform (GCP), Oracle Cloud Infrastructure (OCI - in progress), IBM Cloud (in progress).</w:t>
             </w:r>
           </w:p>
         </w:tc>
@@ -2155,7 +445,7 @@
                 <w:color w:val="202124"/>
                 <w:sz w:val="18"/>
               </w:rPr>
-              <w:t>Security and Networking</w:t>
+              <w:t>Cloud Administration</w:t>
             </w:r>
           </w:p>
         </w:tc>
@@ -2182,7 +472,7 @@
                 <w:color w:val="3C4043"/>
                 <w:sz w:val="17"/>
               </w:rPr>
-              <w:t>Least-privilege IAM, security groups, firewall rules, subnetting, routing, VPN, BGP, DNS, SSL/TLS, monitoring basics, Linux hardening fundamentals.</w:t>
+              <w:t>IAM, VPC/VCN, EC2, Compute Engine, Object and Cloud Storage, Cloud DNS, Route 53, Cloud SQL, Load Balancing, Security Groups, Monitoring.</w:t>
             </w:r>
           </w:p>
         </w:tc>
@@ -2211,7 +501,7 @@
                 <w:color w:val="202124"/>
                 <w:sz w:val="18"/>
               </w:rPr>
-              <w:t>DevOps and Automation</w:t>
+              <w:t>Automation and IaC</w:t>
             </w:r>
           </w:p>
         </w:tc>
@@ -2238,7 +528,7 @@
                 <w:color w:val="3C4043"/>
                 <w:sz w:val="17"/>
               </w:rPr>
-              <w:t>Docker, Kubernetes, Terraform fundamentals, GitHub Actions, AWS CodePipeline, Bash, Linux operations, Postman, CI/CD deployment practice.</w:t>
+              <w:t>Terraform, Docker, Kubernetes, GitHub Actions, AWS CodePipeline, CI/CD, Bash scripting.</w:t>
             </w:r>
           </w:p>
         </w:tc>
@@ -2267,7 +557,7 @@
                 <w:color w:val="202124"/>
                 <w:sz w:val="18"/>
               </w:rPr>
-              <w:t>Programming and Backend</w:t>
+              <w:t>Networking and Security</w:t>
             </w:r>
           </w:p>
         </w:tc>
@@ -2294,7 +584,63 @@
                 <w:color w:val="3C4043"/>
                 <w:sz w:val="17"/>
               </w:rPr>
-              <w:t>Python, FastAPI, Java, REST APIs, secure authentication, database integration, API debugging, backend automation, PostgreSQL.</w:t>
+              <w:t>VPN, HA VPN, Site-to-Site VPN, BGP, SSL/TLS, DNS migration, subnetting, routing, least-privilege access control.</w:t>
+            </w:r>
+          </w:p>
+        </w:tc>
+      </w:tr>
+      <w:tr>
+        <w:tc>
+          <w:tcPr>
+            <w:tcW w:type="dxa" w:w="5400"/>
+            <w:vAlign w:val="top"/>
+            <w:shd w:fill="FFFFFF"/>
+            <w:tcBorders>
+              <w:top w:val="single" w:sz="8" w:space="0" w:color="DCE6F2"/>
+              <w:left w:val="single" w:sz="8" w:space="0" w:color="DCE6F2"/>
+              <w:bottom w:val="single" w:sz="8" w:space="0" w:color="DCE6F2"/>
+              <w:right w:val="single" w:sz="8" w:space="0" w:color="DCE6F2"/>
+            </w:tcBorders>
+          </w:tcPr>
+          <w:p>
+            <w:pPr>
+              <w:spacing w:after="40"/>
+            </w:pPr>
+            <w:r>
+              <w:rPr>
+                <w:rFonts w:ascii="Aptos" w:hAnsi="Aptos"/>
+                <w:b/>
+                <w:color w:val="202124"/>
+                <w:sz w:val="18"/>
+              </w:rPr>
+              <w:t>Programming</w:t>
+            </w:r>
+          </w:p>
+        </w:tc>
+        <w:tc>
+          <w:tcPr>
+            <w:tcW w:type="dxa" w:w="5400"/>
+            <w:vAlign w:val="top"/>
+            <w:shd w:fill="FFFFFF"/>
+            <w:tcBorders>
+              <w:top w:val="single" w:sz="8" w:space="0" w:color="DCE6F2"/>
+              <w:left w:val="single" w:sz="8" w:space="0" w:color="DCE6F2"/>
+              <w:bottom w:val="single" w:sz="8" w:space="0" w:color="DCE6F2"/>
+              <w:right w:val="single" w:sz="8" w:space="0" w:color="DCE6F2"/>
+            </w:tcBorders>
+          </w:tcPr>
+          <w:p>
+            <w:pPr>
+              <w:spacing w:after="40"/>
+            </w:pPr>
+            <w:r>
+              <w:rPr>
+                <w:rFonts w:ascii="Aptos" w:hAnsi="Aptos"/>
+                <w:b w:val="0"/>
+                <w:color w:val="3C4043"/>
+                <w:sz w:val="17"/>
+              </w:rPr>
+              <w:t>Python, Bash, FastAPI, REST APIs, Java, PostgreSQL, Linux Administration, Git.</w:t>
             </w:r>
           </w:p>
         </w:tc>
@@ -2302,7 +648,7 @@
     </w:tbl>
     <w:p>
       <w:pPr>
-        <w:spacing w:before="260" w:after="140"/>
+        <w:spacing w:before="240" w:after="120"/>
       </w:pPr>
       <w:r>
         <w:rPr>
@@ -2311,7 +657,851 @@
           <w:color w:val="202124"/>
           <w:sz w:val="21"/>
         </w:rPr>
-        <w:t>CERTIFICATIONS AND LEARNING</w:t>
+        <w:t>PROFESSIONAL EXPERIENCE</w:t>
+      </w:r>
+    </w:p>
+    <w:tbl>
+      <w:tblPr>
+        <w:tblW w:type="auto" w:w="0"/>
+        <w:jc w:val="center"/>
+        <w:tblLayout w:type="autofit"/>
+        <w:tblLook w:firstColumn="1" w:firstRow="1" w:lastColumn="0" w:lastRow="0" w:noHBand="0" w:noVBand="1" w:val="04A0"/>
+      </w:tblPr>
+      <w:tblGrid>
+        <w:gridCol w:w="10800"/>
+      </w:tblGrid>
+      <w:tr>
+        <w:tc>
+          <w:tcPr>
+            <w:tcW w:type="dxa" w:w="10800"/>
+            <w:vAlign w:val="top"/>
+            <w:shd w:fill="FFFFFF"/>
+            <w:tcBorders>
+              <w:top w:val="single" w:sz="8" w:space="0" w:color="DCE6F2"/>
+              <w:left w:val="single" w:sz="8" w:space="0" w:color="DCE6F2"/>
+              <w:bottom w:val="single" w:sz="8" w:space="0" w:color="DCE6F2"/>
+              <w:right w:val="single" w:sz="8" w:space="0" w:color="DCE6F2"/>
+            </w:tcBorders>
+          </w:tcPr>
+          <w:p>
+            <w:pPr>
+              <w:spacing w:after="40"/>
+            </w:pPr>
+            <w:r>
+              <w:drawing>
+                <wp:inline xmlns:a="http://schemas.openxmlformats.org/drawingml/2006/main" xmlns:pic="http://schemas.openxmlformats.org/drawingml/2006/picture">
+                  <wp:extent cx="182880" cy="182880"/>
+                  <wp:docPr id="5" name="Picture 5"/>
+                  <wp:cNvGraphicFramePr>
+                    <a:graphicFrameLocks noChangeAspect="1"/>
+                  </wp:cNvGraphicFramePr>
+                  <a:graphic>
+                    <a:graphicData uri="http://schemas.openxmlformats.org/drawingml/2006/picture">
+                      <pic:pic>
+                        <pic:nvPicPr>
+                          <pic:cNvPr id="0" name="googlecloud.png"/>
+                          <pic:cNvPicPr/>
+                        </pic:nvPicPr>
+                        <pic:blipFill>
+                          <a:blip r:embed="rId13"/>
+                          <a:stretch>
+                            <a:fillRect/>
+                          </a:stretch>
+                        </pic:blipFill>
+                        <pic:spPr>
+                          <a:xfrm>
+                            <a:off x="0" y="0"/>
+                            <a:ext cx="182880" cy="182880"/>
+                          </a:xfrm>
+                          <a:prstGeom prst="rect"/>
+                        </pic:spPr>
+                      </pic:pic>
+                    </a:graphicData>
+                  </a:graphic>
+                </wp:inline>
+              </w:drawing>
+            </w:r>
+            <w:r>
+              <w:t xml:space="preserve"> </w:t>
+            </w:r>
+            <w:r>
+              <w:rPr>
+                <w:rFonts w:ascii="Aptos" w:hAnsi="Aptos"/>
+                <w:b/>
+                <w:color w:val="202124"/>
+                <w:sz w:val="20"/>
+              </w:rPr>
+              <w:t>Cloud Engineer Intern</w:t>
+            </w:r>
+          </w:p>
+          <w:p>
+            <w:r>
+              <w:rPr>
+                <w:rFonts w:ascii="Aptos" w:hAnsi="Aptos"/>
+                <w:b w:val="0"/>
+                <w:color w:val="5F6368"/>
+                <w:sz w:val="17"/>
+              </w:rPr>
+              <w:t>Cloud Ambassadors, Google Cloud Partner | Jan 2026 - Present</w:t>
+            </w:r>
+          </w:p>
+          <w:p>
+            <w:pPr>
+              <w:pStyle w:val="ListBullet"/>
+              <w:spacing w:after="40"/>
+              <w:ind w:left="259"/>
+            </w:pPr>
+            <w:r>
+              <w:rPr>
+                <w:rFonts w:ascii="Aptos" w:hAnsi="Aptos"/>
+                <w:b w:val="0"/>
+                <w:color w:val="3C4043"/>
+                <w:sz w:val="17"/>
+              </w:rPr>
+              <w:t>Provision and administer Compute Engine, Cloud Storage, IAM roles, VPC networks, firewall rules, and secure access policies.</w:t>
+            </w:r>
+          </w:p>
+          <w:p>
+            <w:pPr>
+              <w:pStyle w:val="ListBullet"/>
+              <w:spacing w:after="40"/>
+              <w:ind w:left="259"/>
+            </w:pPr>
+            <w:r>
+              <w:rPr>
+                <w:rFonts w:ascii="Aptos" w:hAnsi="Aptos"/>
+                <w:b w:val="0"/>
+                <w:color w:val="3C4043"/>
+                <w:sz w:val="17"/>
+              </w:rPr>
+              <w:t>Support AWS and GCP infrastructure operations across networking, IAM, DNS, load balancing, VPN, and migration workflows, including troubleshooting.</w:t>
+            </w:r>
+          </w:p>
+          <w:p>
+            <w:pPr>
+              <w:pStyle w:val="ListBullet"/>
+              <w:spacing w:after="40"/>
+              <w:ind w:left="259"/>
+            </w:pPr>
+            <w:r>
+              <w:rPr>
+                <w:rFonts w:ascii="Aptos" w:hAnsi="Aptos"/>
+                <w:b w:val="0"/>
+                <w:color w:val="3C4043"/>
+                <w:sz w:val="17"/>
+              </w:rPr>
+              <w:t>Configure Cloud DNS and Route 53 records, HTTPS load balancer validation, and SSL/TLS certificate workflows.</w:t>
+            </w:r>
+          </w:p>
+          <w:p>
+            <w:pPr>
+              <w:pStyle w:val="ListBullet"/>
+              <w:spacing w:after="40"/>
+              <w:ind w:left="259"/>
+            </w:pPr>
+            <w:r>
+              <w:rPr>
+                <w:rFonts w:ascii="Aptos" w:hAnsi="Aptos"/>
+                <w:b w:val="0"/>
+                <w:color w:val="3C4043"/>
+                <w:sz w:val="17"/>
+              </w:rPr>
+              <w:t>Apply Docker, Kubernetes/GKE, Linux, Git, Bash, and Terraform fundamentals for infrastructure automation.</w:t>
+            </w:r>
+          </w:p>
+        </w:tc>
+      </w:tr>
+    </w:tbl>
+    <w:tbl>
+      <w:tblPr>
+        <w:tblW w:type="auto" w:w="0"/>
+        <w:jc w:val="center"/>
+        <w:tblLayout w:type="autofit"/>
+        <w:tblLook w:firstColumn="1" w:firstRow="1" w:lastColumn="0" w:lastRow="0" w:noHBand="0" w:noVBand="1" w:val="04A0"/>
+      </w:tblPr>
+      <w:tblGrid>
+        <w:gridCol w:w="10800"/>
+      </w:tblGrid>
+      <w:tr>
+        <w:tc>
+          <w:tcPr>
+            <w:tcW w:type="dxa" w:w="10800"/>
+            <w:vAlign w:val="top"/>
+            <w:shd w:fill="FFFFFF"/>
+            <w:tcBorders>
+              <w:top w:val="single" w:sz="8" w:space="0" w:color="DCE6F2"/>
+              <w:left w:val="single" w:sz="8" w:space="0" w:color="DCE6F2"/>
+              <w:bottom w:val="single" w:sz="8" w:space="0" w:color="DCE6F2"/>
+              <w:right w:val="single" w:sz="8" w:space="0" w:color="DCE6F2"/>
+            </w:tcBorders>
+          </w:tcPr>
+          <w:p>
+            <w:pPr>
+              <w:spacing w:after="40"/>
+            </w:pPr>
+            <w:r>
+              <w:drawing>
+                <wp:inline xmlns:a="http://schemas.openxmlformats.org/drawingml/2006/main" xmlns:pic="http://schemas.openxmlformats.org/drawingml/2006/picture">
+                  <wp:extent cx="182880" cy="182880"/>
+                  <wp:docPr id="6" name="Picture 6"/>
+                  <wp:cNvGraphicFramePr>
+                    <a:graphicFrameLocks noChangeAspect="1"/>
+                  </wp:cNvGraphicFramePr>
+                  <a:graphic>
+                    <a:graphicData uri="http://schemas.openxmlformats.org/drawingml/2006/picture">
+                      <pic:pic>
+                        <pic:nvPicPr>
+                          <pic:cNvPr id="0" name="python.png"/>
+                          <pic:cNvPicPr/>
+                        </pic:nvPicPr>
+                        <pic:blipFill>
+                          <a:blip r:embed="rId14"/>
+                          <a:stretch>
+                            <a:fillRect/>
+                          </a:stretch>
+                        </pic:blipFill>
+                        <pic:spPr>
+                          <a:xfrm>
+                            <a:off x="0" y="0"/>
+                            <a:ext cx="182880" cy="182880"/>
+                          </a:xfrm>
+                          <a:prstGeom prst="rect"/>
+                        </pic:spPr>
+                      </pic:pic>
+                    </a:graphicData>
+                  </a:graphic>
+                </wp:inline>
+              </w:drawing>
+            </w:r>
+            <w:r>
+              <w:t xml:space="preserve"> </w:t>
+            </w:r>
+            <w:r>
+              <w:rPr>
+                <w:rFonts w:ascii="Aptos" w:hAnsi="Aptos"/>
+                <w:b/>
+                <w:color w:val="202124"/>
+                <w:sz w:val="20"/>
+              </w:rPr>
+              <w:t>Backend Developer</w:t>
+            </w:r>
+          </w:p>
+          <w:p>
+            <w:r>
+              <w:rPr>
+                <w:rFonts w:ascii="Aptos" w:hAnsi="Aptos"/>
+                <w:b w:val="0"/>
+                <w:color w:val="5F6368"/>
+                <w:sz w:val="17"/>
+              </w:rPr>
+              <w:t>Chella Corporations | Jul 2025 - Dec 2025</w:t>
+            </w:r>
+          </w:p>
+          <w:p>
+            <w:pPr>
+              <w:pStyle w:val="ListBullet"/>
+              <w:spacing w:after="40"/>
+              <w:ind w:left="259"/>
+            </w:pPr>
+            <w:r>
+              <w:rPr>
+                <w:rFonts w:ascii="Aptos" w:hAnsi="Aptos"/>
+                <w:b w:val="0"/>
+                <w:color w:val="3C4043"/>
+                <w:sz w:val="17"/>
+              </w:rPr>
+              <w:t>Developed REST APIs using Python and FastAPI for an AI-driven medical platform.</w:t>
+            </w:r>
+          </w:p>
+          <w:p>
+            <w:pPr>
+              <w:pStyle w:val="ListBullet"/>
+              <w:spacing w:after="40"/>
+              <w:ind w:left="259"/>
+            </w:pPr>
+            <w:r>
+              <w:rPr>
+                <w:rFonts w:ascii="Aptos" w:hAnsi="Aptos"/>
+                <w:b w:val="0"/>
+                <w:color w:val="3C4043"/>
+                <w:sz w:val="17"/>
+              </w:rPr>
+              <w:t>Implemented secure authentication, service integration, database integration, and debugging for production systems.</w:t>
+            </w:r>
+          </w:p>
+          <w:p>
+            <w:pPr>
+              <w:pStyle w:val="ListBullet"/>
+              <w:spacing w:after="40"/>
+              <w:ind w:left="259"/>
+            </w:pPr>
+            <w:r>
+              <w:rPr>
+                <w:rFonts w:ascii="Aptos" w:hAnsi="Aptos"/>
+                <w:b w:val="0"/>
+                <w:color w:val="3C4043"/>
+                <w:sz w:val="17"/>
+              </w:rPr>
+              <w:t>Deployed and maintained backend services on Linux servers, strengthening cloud operations readiness.</w:t>
+            </w:r>
+          </w:p>
+        </w:tc>
+      </w:tr>
+    </w:tbl>
+    <w:tbl>
+      <w:tblPr>
+        <w:tblW w:type="auto" w:w="0"/>
+        <w:jc w:val="center"/>
+        <w:tblLayout w:type="autofit"/>
+        <w:tblLook w:firstColumn="1" w:firstRow="1" w:lastColumn="0" w:lastRow="0" w:noHBand="0" w:noVBand="1" w:val="04A0"/>
+      </w:tblPr>
+      <w:tblGrid>
+        <w:gridCol w:w="10800"/>
+      </w:tblGrid>
+      <w:tr>
+        <w:tc>
+          <w:tcPr>
+            <w:tcW w:type="dxa" w:w="10800"/>
+            <w:vAlign w:val="top"/>
+            <w:shd w:fill="FFFFFF"/>
+            <w:tcBorders>
+              <w:top w:val="single" w:sz="8" w:space="0" w:color="DCE6F2"/>
+              <w:left w:val="single" w:sz="8" w:space="0" w:color="DCE6F2"/>
+              <w:bottom w:val="single" w:sz="8" w:space="0" w:color="DCE6F2"/>
+              <w:right w:val="single" w:sz="8" w:space="0" w:color="DCE6F2"/>
+            </w:tcBorders>
+          </w:tcPr>
+          <w:p>
+            <w:pPr>
+              <w:spacing w:after="40"/>
+            </w:pPr>
+            <w:r>
+              <w:drawing>
+                <wp:inline xmlns:a="http://schemas.openxmlformats.org/drawingml/2006/main" xmlns:pic="http://schemas.openxmlformats.org/drawingml/2006/picture">
+                  <wp:extent cx="182880" cy="182880"/>
+                  <wp:docPr id="7" name="Picture 7"/>
+                  <wp:cNvGraphicFramePr>
+                    <a:graphicFrameLocks noChangeAspect="1"/>
+                  </wp:cNvGraphicFramePr>
+                  <a:graphic>
+                    <a:graphicData uri="http://schemas.openxmlformats.org/drawingml/2006/picture">
+                      <pic:pic>
+                        <pic:nvPicPr>
+                          <pic:cNvPr id="0" name="fastapi.png"/>
+                          <pic:cNvPicPr/>
+                        </pic:nvPicPr>
+                        <pic:blipFill>
+                          <a:blip r:embed="rId15"/>
+                          <a:stretch>
+                            <a:fillRect/>
+                          </a:stretch>
+                        </pic:blipFill>
+                        <pic:spPr>
+                          <a:xfrm>
+                            <a:off x="0" y="0"/>
+                            <a:ext cx="182880" cy="182880"/>
+                          </a:xfrm>
+                          <a:prstGeom prst="rect"/>
+                        </pic:spPr>
+                      </pic:pic>
+                    </a:graphicData>
+                  </a:graphic>
+                </wp:inline>
+              </w:drawing>
+            </w:r>
+            <w:r>
+              <w:t xml:space="preserve"> </w:t>
+            </w:r>
+            <w:r>
+              <w:rPr>
+                <w:rFonts w:ascii="Aptos" w:hAnsi="Aptos"/>
+                <w:b/>
+                <w:color w:val="202124"/>
+                <w:sz w:val="20"/>
+              </w:rPr>
+              <w:t>AI Application Developer Intern</w:t>
+            </w:r>
+          </w:p>
+          <w:p>
+            <w:r>
+              <w:rPr>
+                <w:rFonts w:ascii="Aptos" w:hAnsi="Aptos"/>
+                <w:b w:val="0"/>
+                <w:color w:val="5F6368"/>
+                <w:sz w:val="17"/>
+              </w:rPr>
+              <w:t>Infosys Springboard | Sep 2025 - Nov 2025</w:t>
+            </w:r>
+          </w:p>
+          <w:p>
+            <w:pPr>
+              <w:pStyle w:val="ListBullet"/>
+              <w:spacing w:after="40"/>
+              <w:ind w:left="259"/>
+            </w:pPr>
+            <w:r>
+              <w:rPr>
+                <w:rFonts w:ascii="Aptos" w:hAnsi="Aptos"/>
+                <w:b w:val="0"/>
+                <w:color w:val="3C4043"/>
+                <w:sz w:val="17"/>
+              </w:rPr>
+              <w:t>Built a RAG-based compliance checker for automated document retrieval, analysis, and scoring.</w:t>
+            </w:r>
+          </w:p>
+          <w:p>
+            <w:pPr>
+              <w:pStyle w:val="ListBullet"/>
+              <w:spacing w:after="40"/>
+              <w:ind w:left="259"/>
+            </w:pPr>
+            <w:r>
+              <w:rPr>
+                <w:rFonts w:ascii="Aptos" w:hAnsi="Aptos"/>
+                <w:b w:val="0"/>
+                <w:color w:val="3C4043"/>
+                <w:sz w:val="17"/>
+              </w:rPr>
+              <w:t>Integrated GPT-based workflows that improved compliance review efficiency by 70%.</w:t>
+            </w:r>
+          </w:p>
+        </w:tc>
+      </w:tr>
+    </w:tbl>
+    <w:p>
+      <w:r>
+        <w:br w:type="page"/>
+      </w:r>
+    </w:p>
+    <w:p>
+      <w:pPr>
+        <w:spacing w:before="240" w:after="120"/>
+      </w:pPr>
+      <w:r>
+        <w:rPr>
+          <w:rFonts w:ascii="Aptos" w:hAnsi="Aptos"/>
+          <w:b/>
+          <w:color w:val="202124"/>
+          <w:sz w:val="21"/>
+        </w:rPr>
+        <w:t>PROJECT HIGHLIGHTS</w:t>
+      </w:r>
+    </w:p>
+    <w:tbl>
+      <w:tblPr>
+        <w:tblW w:type="auto" w:w="0"/>
+        <w:jc w:val="center"/>
+        <w:tblLayout w:type="autofit"/>
+        <w:tblLook w:firstColumn="1" w:firstRow="1" w:lastColumn="0" w:lastRow="0" w:noHBand="0" w:noVBand="1" w:val="04A0"/>
+      </w:tblPr>
+      <w:tblGrid>
+        <w:gridCol w:w="10800"/>
+      </w:tblGrid>
+      <w:tr>
+        <w:tc>
+          <w:tcPr>
+            <w:tcW w:type="dxa" w:w="10800"/>
+            <w:vAlign w:val="top"/>
+            <w:shd w:fill="FFFFFF"/>
+            <w:tcBorders>
+              <w:top w:val="single" w:sz="8" w:space="0" w:color="DCE6F2"/>
+              <w:left w:val="single" w:sz="8" w:space="0" w:color="DCE6F2"/>
+              <w:bottom w:val="single" w:sz="8" w:space="0" w:color="DCE6F2"/>
+              <w:right w:val="single" w:sz="8" w:space="0" w:color="DCE6F2"/>
+            </w:tcBorders>
+          </w:tcPr>
+          <w:p>
+            <w:pPr>
+              <w:spacing w:after="40"/>
+            </w:pPr>
+            <w:r>
+              <w:drawing>
+                <wp:inline xmlns:a="http://schemas.openxmlformats.org/drawingml/2006/main" xmlns:pic="http://schemas.openxmlformats.org/drawingml/2006/picture">
+                  <wp:extent cx="182880" cy="182880"/>
+                  <wp:docPr id="8" name="Picture 8"/>
+                  <wp:cNvGraphicFramePr>
+                    <a:graphicFrameLocks noChangeAspect="1"/>
+                  </wp:cNvGraphicFramePr>
+                  <a:graphic>
+                    <a:graphicData uri="http://schemas.openxmlformats.org/drawingml/2006/picture">
+                      <pic:pic>
+                        <pic:nvPicPr>
+                          <pic:cNvPr id="0" name="aws.png"/>
+                          <pic:cNvPicPr/>
+                        </pic:nvPicPr>
+                        <pic:blipFill>
+                          <a:blip r:embed="rId9"/>
+                          <a:stretch>
+                            <a:fillRect/>
+                          </a:stretch>
+                        </pic:blipFill>
+                        <pic:spPr>
+                          <a:xfrm>
+                            <a:off x="0" y="0"/>
+                            <a:ext cx="182880" cy="182880"/>
+                          </a:xfrm>
+                          <a:prstGeom prst="rect"/>
+                        </pic:spPr>
+                      </pic:pic>
+                    </a:graphicData>
+                  </a:graphic>
+                </wp:inline>
+              </w:drawing>
+            </w:r>
+            <w:r>
+              <w:t xml:space="preserve"> </w:t>
+            </w:r>
+            <w:r>
+              <w:rPr>
+                <w:rFonts w:ascii="Aptos" w:hAnsi="Aptos"/>
+                <w:b/>
+                <w:color w:val="202124"/>
+                <w:sz w:val="19"/>
+              </w:rPr>
+              <w:t>AWS Route 53 to Google Cloud DNS Migration</w:t>
+            </w:r>
+          </w:p>
+          <w:p>
+            <w:r>
+              <w:rPr>
+                <w:rFonts w:ascii="Aptos" w:hAnsi="Aptos"/>
+                <w:b w:val="0"/>
+                <w:color w:val="3C4043"/>
+                <w:sz w:val="16"/>
+              </w:rPr>
+              <w:t>Documented a zero-downtime domain migration covering DNS inventory, Cloud DNS zone setup, record replication, NS cutover, validation, and rollback planning.</w:t>
+            </w:r>
+          </w:p>
+        </w:tc>
+      </w:tr>
+    </w:tbl>
+    <w:tbl>
+      <w:tblPr>
+        <w:tblW w:type="auto" w:w="0"/>
+        <w:jc w:val="center"/>
+        <w:tblLayout w:type="autofit"/>
+        <w:tblLook w:firstColumn="1" w:firstRow="1" w:lastColumn="0" w:lastRow="0" w:noHBand="0" w:noVBand="1" w:val="04A0"/>
+      </w:tblPr>
+      <w:tblGrid>
+        <w:gridCol w:w="10800"/>
+      </w:tblGrid>
+      <w:tr>
+        <w:tc>
+          <w:tcPr>
+            <w:tcW w:type="dxa" w:w="10800"/>
+            <w:vAlign w:val="top"/>
+            <w:shd w:fill="FFFFFF"/>
+            <w:tcBorders>
+              <w:top w:val="single" w:sz="8" w:space="0" w:color="DCE6F2"/>
+              <w:left w:val="single" w:sz="8" w:space="0" w:color="DCE6F2"/>
+              <w:bottom w:val="single" w:sz="8" w:space="0" w:color="DCE6F2"/>
+              <w:right w:val="single" w:sz="8" w:space="0" w:color="DCE6F2"/>
+            </w:tcBorders>
+          </w:tcPr>
+          <w:p>
+            <w:pPr>
+              <w:spacing w:after="40"/>
+            </w:pPr>
+            <w:r>
+              <w:rPr>
+                <w:rFonts w:ascii="Aptos" w:hAnsi="Aptos"/>
+                <w:b/>
+                <w:color w:val="202124"/>
+                <w:sz w:val="19"/>
+              </w:rPr>
+              <w:t>Private AWS RDS to GCP Cloud SQL Migration</w:t>
+            </w:r>
+          </w:p>
+          <w:p>
+            <w:r>
+              <w:rPr>
+                <w:rFonts w:ascii="Aptos" w:hAnsi="Aptos"/>
+                <w:b w:val="0"/>
+                <w:color w:val="3C4043"/>
+                <w:sz w:val="16"/>
+              </w:rPr>
+              <w:t>Designed a private PostgreSQL migration using VPC/VGW, HA VPN, IPsec, BGP, Private Services Access, and Database Migration Service.</w:t>
+            </w:r>
+          </w:p>
+        </w:tc>
+      </w:tr>
+    </w:tbl>
+    <w:tbl>
+      <w:tblPr>
+        <w:tblW w:type="auto" w:w="0"/>
+        <w:jc w:val="center"/>
+        <w:tblLayout w:type="autofit"/>
+        <w:tblLook w:firstColumn="1" w:firstRow="1" w:lastColumn="0" w:lastRow="0" w:noHBand="0" w:noVBand="1" w:val="04A0"/>
+      </w:tblPr>
+      <w:tblGrid>
+        <w:gridCol w:w="10800"/>
+      </w:tblGrid>
+      <w:tr>
+        <w:tc>
+          <w:tcPr>
+            <w:tcW w:type="dxa" w:w="10800"/>
+            <w:vAlign w:val="top"/>
+            <w:shd w:fill="FFFFFF"/>
+            <w:tcBorders>
+              <w:top w:val="single" w:sz="8" w:space="0" w:color="DCE6F2"/>
+              <w:left w:val="single" w:sz="8" w:space="0" w:color="DCE6F2"/>
+              <w:bottom w:val="single" w:sz="8" w:space="0" w:color="DCE6F2"/>
+              <w:right w:val="single" w:sz="8" w:space="0" w:color="DCE6F2"/>
+            </w:tcBorders>
+          </w:tcPr>
+          <w:p>
+            <w:pPr>
+              <w:spacing w:after="40"/>
+            </w:pPr>
+            <w:r>
+              <w:drawing>
+                <wp:inline xmlns:a="http://schemas.openxmlformats.org/drawingml/2006/main" xmlns:pic="http://schemas.openxmlformats.org/drawingml/2006/picture">
+                  <wp:extent cx="182880" cy="182880"/>
+                  <wp:docPr id="9" name="Picture 9"/>
+                  <wp:cNvGraphicFramePr>
+                    <a:graphicFrameLocks noChangeAspect="1"/>
+                  </wp:cNvGraphicFramePr>
+                  <a:graphic>
+                    <a:graphicData uri="http://schemas.openxmlformats.org/drawingml/2006/picture">
+                      <pic:pic>
+                        <pic:nvPicPr>
+                          <pic:cNvPr id="0" name="googlecloud.png"/>
+                          <pic:cNvPicPr/>
+                        </pic:nvPicPr>
+                        <pic:blipFill>
+                          <a:blip r:embed="rId13"/>
+                          <a:stretch>
+                            <a:fillRect/>
+                          </a:stretch>
+                        </pic:blipFill>
+                        <pic:spPr>
+                          <a:xfrm>
+                            <a:off x="0" y="0"/>
+                            <a:ext cx="182880" cy="182880"/>
+                          </a:xfrm>
+                          <a:prstGeom prst="rect"/>
+                        </pic:spPr>
+                      </pic:pic>
+                    </a:graphicData>
+                  </a:graphic>
+                </wp:inline>
+              </w:drawing>
+            </w:r>
+            <w:r>
+              <w:t xml:space="preserve"> </w:t>
+            </w:r>
+            <w:r>
+              <w:rPr>
+                <w:rFonts w:ascii="Aptos" w:hAnsi="Aptos"/>
+                <w:b/>
+                <w:color w:val="202124"/>
+                <w:sz w:val="19"/>
+              </w:rPr>
+              <w:t>Private Cloud Storage Behind Load Balancer</w:t>
+            </w:r>
+          </w:p>
+          <w:p>
+            <w:r>
+              <w:rPr>
+                <w:rFonts w:ascii="Aptos" w:hAnsi="Aptos"/>
+                <w:b w:val="0"/>
+                <w:color w:val="3C4043"/>
+                <w:sz w:val="16"/>
+              </w:rPr>
+              <w:t>Built a private storage access pattern using a global external load balancer with backend bucket validation.</w:t>
+            </w:r>
+          </w:p>
+        </w:tc>
+      </w:tr>
+    </w:tbl>
+    <w:tbl>
+      <w:tblPr>
+        <w:tblW w:type="auto" w:w="0"/>
+        <w:jc w:val="center"/>
+        <w:tblLayout w:type="autofit"/>
+        <w:tblLook w:firstColumn="1" w:firstRow="1" w:lastColumn="0" w:lastRow="0" w:noHBand="0" w:noVBand="1" w:val="04A0"/>
+      </w:tblPr>
+      <w:tblGrid>
+        <w:gridCol w:w="10800"/>
+      </w:tblGrid>
+      <w:tr>
+        <w:tc>
+          <w:tcPr>
+            <w:tcW w:type="dxa" w:w="10800"/>
+            <w:vAlign w:val="top"/>
+            <w:shd w:fill="FFFFFF"/>
+            <w:tcBorders>
+              <w:top w:val="single" w:sz="8" w:space="0" w:color="DCE6F2"/>
+              <w:left w:val="single" w:sz="8" w:space="0" w:color="DCE6F2"/>
+              <w:bottom w:val="single" w:sz="8" w:space="0" w:color="DCE6F2"/>
+              <w:right w:val="single" w:sz="8" w:space="0" w:color="DCE6F2"/>
+            </w:tcBorders>
+          </w:tcPr>
+          <w:p>
+            <w:pPr>
+              <w:spacing w:after="40"/>
+            </w:pPr>
+            <w:r>
+              <w:drawing>
+                <wp:inline xmlns:a="http://schemas.openxmlformats.org/drawingml/2006/main" xmlns:pic="http://schemas.openxmlformats.org/drawingml/2006/picture">
+                  <wp:extent cx="182880" cy="182880"/>
+                  <wp:docPr id="10" name="Picture 10"/>
+                  <wp:cNvGraphicFramePr>
+                    <a:graphicFrameLocks noChangeAspect="1"/>
+                  </wp:cNvGraphicFramePr>
+                  <a:graphic>
+                    <a:graphicData uri="http://schemas.openxmlformats.org/drawingml/2006/picture">
+                      <pic:pic>
+                        <pic:nvPicPr>
+                          <pic:cNvPr id="0" name="googlecloud.png"/>
+                          <pic:cNvPicPr/>
+                        </pic:nvPicPr>
+                        <pic:blipFill>
+                          <a:blip r:embed="rId13"/>
+                          <a:stretch>
+                            <a:fillRect/>
+                          </a:stretch>
+                        </pic:blipFill>
+                        <pic:spPr>
+                          <a:xfrm>
+                            <a:off x="0" y="0"/>
+                            <a:ext cx="182880" cy="182880"/>
+                          </a:xfrm>
+                          <a:prstGeom prst="rect"/>
+                        </pic:spPr>
+                      </pic:pic>
+                    </a:graphicData>
+                  </a:graphic>
+                </wp:inline>
+              </w:drawing>
+            </w:r>
+            <w:r>
+              <w:t xml:space="preserve"> </w:t>
+            </w:r>
+            <w:r>
+              <w:rPr>
+                <w:rFonts w:ascii="Aptos" w:hAnsi="Aptos"/>
+                <w:b/>
+                <w:color w:val="202124"/>
+                <w:sz w:val="19"/>
+              </w:rPr>
+              <w:t>AWS to GCP Site-to-Site VPN</w:t>
+            </w:r>
+          </w:p>
+          <w:p>
+            <w:r>
+              <w:rPr>
+                <w:rFonts w:ascii="Aptos" w:hAnsi="Aptos"/>
+                <w:b w:val="0"/>
+                <w:color w:val="3C4043"/>
+                <w:sz w:val="16"/>
+              </w:rPr>
+              <w:t>Configured hybrid-cloud VPN connectivity with secure tunnel setup, routing, and validation.</w:t>
+            </w:r>
+          </w:p>
+        </w:tc>
+      </w:tr>
+    </w:tbl>
+    <w:tbl>
+      <w:tblPr>
+        <w:tblW w:type="auto" w:w="0"/>
+        <w:jc w:val="center"/>
+        <w:tblLayout w:type="autofit"/>
+        <w:tblLook w:firstColumn="1" w:firstRow="1" w:lastColumn="0" w:lastRow="0" w:noHBand="0" w:noVBand="1" w:val="04A0"/>
+      </w:tblPr>
+      <w:tblGrid>
+        <w:gridCol w:w="10800"/>
+      </w:tblGrid>
+      <w:tr>
+        <w:tc>
+          <w:tcPr>
+            <w:tcW w:type="dxa" w:w="10800"/>
+            <w:vAlign w:val="top"/>
+            <w:shd w:fill="FFFFFF"/>
+            <w:tcBorders>
+              <w:top w:val="single" w:sz="8" w:space="0" w:color="DCE6F2"/>
+              <w:left w:val="single" w:sz="8" w:space="0" w:color="DCE6F2"/>
+              <w:bottom w:val="single" w:sz="8" w:space="0" w:color="DCE6F2"/>
+              <w:right w:val="single" w:sz="8" w:space="0" w:color="DCE6F2"/>
+            </w:tcBorders>
+          </w:tcPr>
+          <w:p>
+            <w:pPr>
+              <w:spacing w:after="40"/>
+            </w:pPr>
+            <w:r>
+              <w:drawing>
+                <wp:inline xmlns:a="http://schemas.openxmlformats.org/drawingml/2006/main" xmlns:pic="http://schemas.openxmlformats.org/drawingml/2006/picture">
+                  <wp:extent cx="182880" cy="182880"/>
+                  <wp:docPr id="11" name="Picture 11"/>
+                  <wp:cNvGraphicFramePr>
+                    <a:graphicFrameLocks noChangeAspect="1"/>
+                  </wp:cNvGraphicFramePr>
+                  <a:graphic>
+                    <a:graphicData uri="http://schemas.openxmlformats.org/drawingml/2006/picture">
+                      <pic:pic>
+                        <pic:nvPicPr>
+                          <pic:cNvPr id="0" name="sonarqube.png"/>
+                          <pic:cNvPicPr/>
+                        </pic:nvPicPr>
+                        <pic:blipFill>
+                          <a:blip r:embed="rId16"/>
+                          <a:stretch>
+                            <a:fillRect/>
+                          </a:stretch>
+                        </pic:blipFill>
+                        <pic:spPr>
+                          <a:xfrm>
+                            <a:off x="0" y="0"/>
+                            <a:ext cx="182880" cy="182880"/>
+                          </a:xfrm>
+                          <a:prstGeom prst="rect"/>
+                        </pic:spPr>
+                      </pic:pic>
+                    </a:graphicData>
+                  </a:graphic>
+                </wp:inline>
+              </w:drawing>
+            </w:r>
+            <w:r>
+              <w:t xml:space="preserve"> </w:t>
+            </w:r>
+            <w:r>
+              <w:rPr>
+                <w:rFonts w:ascii="Aptos" w:hAnsi="Aptos"/>
+                <w:b/>
+                <w:color w:val="202124"/>
+                <w:sz w:val="19"/>
+              </w:rPr>
+              <w:t>Swiggy Demo Application Deployment on AWS and Migration to GCP</w:t>
+            </w:r>
+          </w:p>
+          <w:p>
+            <w:r>
+              <w:rPr>
+                <w:rFonts w:ascii="Aptos" w:hAnsi="Aptos"/>
+                <w:b w:val="0"/>
+                <w:color w:val="3C4043"/>
+                <w:sz w:val="16"/>
+              </w:rPr>
+              <w:t>Created production-style infrastructure with SonarQube, Trivy, and OWASP checks for code quality and image scanning, configured blue-green deployment, and migrated the same pattern to GCP.</w:t>
+            </w:r>
+          </w:p>
+        </w:tc>
+      </w:tr>
+    </w:tbl>
+    <w:p>
+      <w:pPr>
+        <w:spacing w:before="240" w:after="120"/>
+      </w:pPr>
+      <w:r>
+        <w:rPr>
+          <w:rFonts w:ascii="Aptos" w:hAnsi="Aptos"/>
+          <w:b/>
+          <w:color w:val="202124"/>
+          <w:sz w:val="21"/>
+        </w:rPr>
+        <w:t>CERTIFICATIONS</w:t>
       </w:r>
     </w:p>
     <w:tbl>
@@ -2346,7 +1536,7 @@
               <w:drawing>
                 <wp:inline xmlns:a="http://schemas.openxmlformats.org/drawingml/2006/main" xmlns:pic="http://schemas.openxmlformats.org/drawingml/2006/picture">
                   <wp:extent cx="182880" cy="182880"/>
-                  <wp:docPr id="25" name="Picture 25"/>
+                  <wp:docPr id="12" name="Picture 12"/>
                   <wp:cNvGraphicFramePr>
                     <a:graphicFrameLocks noChangeAspect="1"/>
                   </wp:cNvGraphicFramePr>
@@ -2397,7 +1587,7 @@
                 <w:color w:val="3C4043"/>
                 <w:sz w:val="16"/>
               </w:rPr>
-              <w:t>AWS core services, security, pricing, and support fundamentals.</w:t>
+              <w:t>Cloud concepts, AWS core services, security, pricing, and support fundamentals.</w:t>
             </w:r>
           </w:p>
         </w:tc>
@@ -2421,7 +1611,7 @@
               <w:drawing>
                 <wp:inline xmlns:a="http://schemas.openxmlformats.org/drawingml/2006/main" xmlns:pic="http://schemas.openxmlformats.org/drawingml/2006/picture">
                   <wp:extent cx="182880" cy="182880"/>
-                  <wp:docPr id="26" name="Picture 26"/>
+                  <wp:docPr id="13" name="Picture 13"/>
                   <wp:cNvGraphicFramePr>
                     <a:graphicFrameLocks noChangeAspect="1"/>
                   </wp:cNvGraphicFramePr>
@@ -2498,7 +1688,7 @@
               <w:drawing>
                 <wp:inline xmlns:a="http://schemas.openxmlformats.org/drawingml/2006/main" xmlns:pic="http://schemas.openxmlformats.org/drawingml/2006/picture">
                   <wp:extent cx="182880" cy="182880"/>
-                  <wp:docPr id="27" name="Picture 27"/>
+                  <wp:docPr id="14" name="Picture 14"/>
                   <wp:cNvGraphicFramePr>
                     <a:graphicFrameLocks noChangeAspect="1"/>
                   </wp:cNvGraphicFramePr>
@@ -2549,7 +1739,7 @@
                 <w:color w:val="3C4043"/>
                 <w:sz w:val="16"/>
               </w:rPr>
-              <w:t>Skill Competency certificate issued 22-05-2026; certificate no. TNSC-VN-ITS-AWS-0526-0005; scorecard 98.00%, Grade A+.</w:t>
+              <w:t>Grade A+, 98% scorecard; certificate no. TNSC-VN-ITS-AWS-0526-0005.</w:t>
             </w:r>
           </w:p>
         </w:tc>
@@ -2573,7 +1763,7 @@
               <w:drawing>
                 <wp:inline xmlns:a="http://schemas.openxmlformats.org/drawingml/2006/main" xmlns:pic="http://schemas.openxmlformats.org/drawingml/2006/picture">
                   <wp:extent cx="182880" cy="182880"/>
-                  <wp:docPr id="28" name="Picture 28"/>
+                  <wp:docPr id="15" name="Picture 15"/>
                   <wp:cNvGraphicFramePr>
                     <a:graphicFrameLocks noChangeAspect="1"/>
                   </wp:cNvGraphicFramePr>
@@ -2650,7 +1840,7 @@
               <w:drawing>
                 <wp:inline xmlns:a="http://schemas.openxmlformats.org/drawingml/2006/main" xmlns:pic="http://schemas.openxmlformats.org/drawingml/2006/picture">
                   <wp:extent cx="182880" cy="182880"/>
-                  <wp:docPr id="29" name="Picture 29"/>
+                  <wp:docPr id="16" name="Picture 16"/>
                   <wp:cNvGraphicFramePr>
                     <a:graphicFrameLocks noChangeAspect="1"/>
                   </wp:cNvGraphicFramePr>
@@ -2701,7 +1891,7 @@
                 <w:color w:val="3C4043"/>
                 <w:sz w:val="16"/>
               </w:rPr>
-              <w:t>Architecture, infrastructure design, security, reliability, operations, and migration planning.</w:t>
+              <w:t>Cloud architecture, infrastructure design, reliability, operations, and migration planning.</w:t>
             </w:r>
           </w:p>
         </w:tc>
@@ -2725,7 +1915,7 @@
               <w:drawing>
                 <wp:inline xmlns:a="http://schemas.openxmlformats.org/drawingml/2006/main" xmlns:pic="http://schemas.openxmlformats.org/drawingml/2006/picture">
                   <wp:extent cx="182880" cy="182880"/>
-                  <wp:docPr id="30" name="Picture 30"/>
+                  <wp:docPr id="17" name="Picture 17"/>
                   <wp:cNvGraphicFramePr>
                     <a:graphicFrameLocks noChangeAspect="1"/>
                   </wp:cNvGraphicFramePr>
@@ -2733,11 +1923,11 @@
                     <a:graphicData uri="http://schemas.openxmlformats.org/drawingml/2006/picture">
                       <pic:pic>
                         <pic:nvPicPr>
-                          <pic:cNvPr id="0" name="linux.png"/>
+                          <pic:cNvPr id="0" name="googlecloud.png"/>
                           <pic:cNvPicPr/>
                         </pic:nvPicPr>
                         <pic:blipFill>
-                          <a:blip r:embed="rId11"/>
+                          <a:blip r:embed="rId13"/>
                           <a:stretch>
                             <a:fillRect/>
                           </a:stretch>
@@ -2765,7 +1955,7 @@
                 <w:color w:val="202124"/>
                 <w:sz w:val="17"/>
               </w:rPr>
-              <w:t>EC-Council Network Defense Essentials</w:t>
+              <w:t>Google Professional Cloud Security Engineering Learning Path</w:t>
             </w:r>
           </w:p>
           <w:p>
@@ -2776,159 +1966,7 @@
                 <w:color w:val="3C4043"/>
                 <w:sz w:val="16"/>
               </w:rPr>
-              <w:t>Network defense, security fundamentals, and threat-aware engineering basics.</w:t>
-            </w:r>
-          </w:p>
-        </w:tc>
-      </w:tr>
-      <w:tr>
-        <w:tc>
-          <w:tcPr>
-            <w:tcW w:type="dxa" w:w="5400"/>
-            <w:vAlign w:val="top"/>
-            <w:shd w:fill="FFFFFF"/>
-            <w:tcBorders>
-              <w:top w:val="single" w:sz="8" w:space="0" w:color="DCE6F2"/>
-              <w:left w:val="single" w:sz="8" w:space="0" w:color="DCE6F2"/>
-              <w:bottom w:val="single" w:sz="8" w:space="0" w:color="DCE6F2"/>
-              <w:right w:val="single" w:sz="8" w:space="0" w:color="DCE6F2"/>
-            </w:tcBorders>
-          </w:tcPr>
-          <w:p>
-            <w:pPr>
-              <w:spacing w:after="40"/>
-            </w:pPr>
-            <w:r>
-              <w:drawing>
-                <wp:inline xmlns:a="http://schemas.openxmlformats.org/drawingml/2006/main" xmlns:pic="http://schemas.openxmlformats.org/drawingml/2006/picture">
-                  <wp:extent cx="182880" cy="182880"/>
-                  <wp:docPr id="31" name="Picture 31"/>
-                  <wp:cNvGraphicFramePr>
-                    <a:graphicFrameLocks noChangeAspect="1"/>
-                  </wp:cNvGraphicFramePr>
-                  <a:graphic>
-                    <a:graphicData uri="http://schemas.openxmlformats.org/drawingml/2006/picture">
-                      <pic:pic>
-                        <pic:nvPicPr>
-                          <pic:cNvPr id="0" name="cisco.png"/>
-                          <pic:cNvPicPr/>
-                        </pic:nvPicPr>
-                        <pic:blipFill>
-                          <a:blip r:embed="rId23"/>
-                          <a:stretch>
-                            <a:fillRect/>
-                          </a:stretch>
-                        </pic:blipFill>
-                        <pic:spPr>
-                          <a:xfrm>
-                            <a:off x="0" y="0"/>
-                            <a:ext cx="182880" cy="182880"/>
-                          </a:xfrm>
-                          <a:prstGeom prst="rect"/>
-                        </pic:spPr>
-                      </pic:pic>
-                    </a:graphicData>
-                  </a:graphic>
-                </wp:inline>
-              </w:drawing>
-            </w:r>
-            <w:r>
-              <w:t xml:space="preserve"> </w:t>
-            </w:r>
-            <w:r>
-              <w:rPr>
-                <w:rFonts w:ascii="Aptos" w:hAnsi="Aptos"/>
-                <w:b/>
-                <w:color w:val="202124"/>
-                <w:sz w:val="17"/>
-              </w:rPr>
-              <w:t>Cisco Networking Basics</w:t>
-            </w:r>
-          </w:p>
-          <w:p>
-            <w:r>
-              <w:rPr>
-                <w:rFonts w:ascii="Aptos" w:hAnsi="Aptos"/>
-                <w:b w:val="0"/>
-                <w:color w:val="3C4043"/>
-                <w:sz w:val="16"/>
-              </w:rPr>
-              <w:t>Networking concepts that support cloud, Linux, backend, and DevOps workflows.</w:t>
-            </w:r>
-          </w:p>
-        </w:tc>
-        <w:tc>
-          <w:tcPr>
-            <w:tcW w:type="dxa" w:w="5400"/>
-            <w:vAlign w:val="top"/>
-            <w:shd w:fill="FFFFFF"/>
-            <w:tcBorders>
-              <w:top w:val="single" w:sz="8" w:space="0" w:color="DCE6F2"/>
-              <w:left w:val="single" w:sz="8" w:space="0" w:color="DCE6F2"/>
-              <w:bottom w:val="single" w:sz="8" w:space="0" w:color="DCE6F2"/>
-              <w:right w:val="single" w:sz="8" w:space="0" w:color="DCE6F2"/>
-            </w:tcBorders>
-          </w:tcPr>
-          <w:p>
-            <w:pPr>
-              <w:spacing w:after="40"/>
-            </w:pPr>
-            <w:r>
-              <w:drawing>
-                <wp:inline xmlns:a="http://schemas.openxmlformats.org/drawingml/2006/main" xmlns:pic="http://schemas.openxmlformats.org/drawingml/2006/picture">
-                  <wp:extent cx="182880" cy="182880"/>
-                  <wp:docPr id="32" name="Picture 32"/>
-                  <wp:cNvGraphicFramePr>
-                    <a:graphicFrameLocks noChangeAspect="1"/>
-                  </wp:cNvGraphicFramePr>
-                  <a:graphic>
-                    <a:graphicData uri="http://schemas.openxmlformats.org/drawingml/2006/picture">
-                      <pic:pic>
-                        <pic:nvPicPr>
-                          <pic:cNvPr id="0" name="infosys.png"/>
-                          <pic:cNvPicPr/>
-                        </pic:nvPicPr>
-                        <pic:blipFill>
-                          <a:blip r:embed="rId22"/>
-                          <a:stretch>
-                            <a:fillRect/>
-                          </a:stretch>
-                        </pic:blipFill>
-                        <pic:spPr>
-                          <a:xfrm>
-                            <a:off x="0" y="0"/>
-                            <a:ext cx="182880" cy="182880"/>
-                          </a:xfrm>
-                          <a:prstGeom prst="rect"/>
-                        </pic:spPr>
-                      </pic:pic>
-                    </a:graphicData>
-                  </a:graphic>
-                </wp:inline>
-              </w:drawing>
-            </w:r>
-            <w:r>
-              <w:t xml:space="preserve"> </w:t>
-            </w:r>
-            <w:r>
-              <w:rPr>
-                <w:rFonts w:ascii="Aptos" w:hAnsi="Aptos"/>
-                <w:b/>
-                <w:color w:val="202124"/>
-                <w:sz w:val="17"/>
-              </w:rPr>
-              <w:t>Infosys AI Primer</w:t>
-            </w:r>
-          </w:p>
-          <w:p>
-            <w:r>
-              <w:rPr>
-                <w:rFonts w:ascii="Aptos" w:hAnsi="Aptos"/>
-                <w:b w:val="0"/>
-                <w:color w:val="3C4043"/>
-                <w:sz w:val="16"/>
-              </w:rPr>
-              <w:t>AI workflow fundamentals used in compliance automation and backend project work.</w:t>
+              <w:t>In progress.</w:t>
             </w:r>
           </w:p>
         </w:tc>
@@ -2936,7 +1974,7 @@
     </w:tbl>
     <w:p>
       <w:pPr>
-        <w:spacing w:before="260" w:after="140"/>
+        <w:spacing w:before="240" w:after="120"/>
       </w:pPr>
       <w:r>
         <w:rPr>
@@ -2980,7 +2018,7 @@
                 <w:rFonts w:ascii="Aptos" w:hAnsi="Aptos"/>
                 <w:b/>
                 <w:color w:val="202124"/>
-                <w:sz w:val="20"/>
+                <w:sz w:val="19"/>
               </w:rPr>
               <w:t>B.E. Cybersecurity Engineering</w:t>
             </w:r>
@@ -2993,18 +2031,7 @@
                 <w:color w:val="5F6368"/>
                 <w:sz w:val="17"/>
               </w:rPr>
-              <w:t>J.J. College of Engineering and Technology | Anna University | 2022 - 2026 | CGPA: 9.0/10</w:t>
-            </w:r>
-          </w:p>
-          <w:p>
-            <w:r>
-              <w:rPr>
-                <w:rFonts w:ascii="Aptos" w:hAnsi="Aptos"/>
-                <w:b w:val="0"/>
-                <w:color w:val="3C4043"/>
-                <w:sz w:val="17"/>
-              </w:rPr>
-              <w:t>Coursework aligned to computer networks, operating systems, cryptography, distributed systems, cloud infrastructure, and security.</w:t>
+              <w:t>J.J. College of Engineering and Technology, Anna University | 2022 - 2026 | CGPA: 9.0 / 10</w:t>
             </w:r>
           </w:p>
         </w:tc>

</xml_diff>